<commit_message>
Guia de defensa: seccion de balance termico y numeros actualizados
Co-Authored-By: Claude Sonnet 5.5 <noreply@anthropic.com>
Claude-Session: https://claude.ai/code/session_01NNMcFTBbEuLfDho1wCZzu7
</commit_message>
<xml_diff>
--- a/planillas/Guia para la defensa del TP.docx
+++ b/planillas/Guia para la defensa del TP.docx
@@ -2,32 +2,6 @@
 <file path=word/document.xml><?xml version="1.0" encoding="utf-8"?>
 <w:document xmlns:w="http://schemas.openxmlformats.org/wordprocessingml/2006/main" xmlns:m="http://schemas.openxmlformats.org/officeDocument/2006/math" xmlns:r="http://schemas.openxmlformats.org/officeDocument/2006/relationships" xmlns:o="urn:schemas-microsoft-com:office:office" xmlns:v="urn:schemas-microsoft-com:vml" xmlns:w10="urn:schemas-microsoft-com:office:word" xmlns:a="http://schemas.openxmlformats.org/drawingml/2006/main" xmlns:pic="http://schemas.openxmlformats.org/drawingml/2006/picture" xmlns:wp="http://schemas.openxmlformats.org/drawingml/2006/wordprocessingDrawing">
   <w:body>
-    <w:sdt>
-      <w:sdtPr>
-        <w:docPartObj>
-          <w:docPartGallery w:val="Table of Contents"/>
-          <w:docPartUnique/>
-        </w:docPartObj>
-      </w:sdtPr>
-      <w:sdtContent>
-        <w:p>
-          <w:pPr>
-            <w:pStyle w:val="TOCHeading"/>
-          </w:pPr>
-          <w:r>
-            <w:t xml:space="preserve">Table of Contents</w:t>
-          </w:r>
-        </w:p>
-        <w:p>
-          <w:r>
-            <w:fldChar w:fldCharType="begin" w:dirty="true"/>
-            <w:instrText xml:space="preserve">TOC \o "1-2" \h \z \u</w:instrText>
-            <w:fldChar w:fldCharType="separate"/>
-            <w:fldChar w:fldCharType="end"/>
-          </w:r>
-        </w:p>
-      </w:sdtContent>
-    </w:sdt>
     <w:bookmarkStart w:id="20" w:name="guía-para-la-defensa-del-tp"/>
     <w:p>
       <w:pPr>
@@ -160,9 +134,6 @@
               <w:jc w:val="left"/>
             </w:pPr>
             <w:r>
-              <w:rPr>
-                <w:b/>
-              </w:rPr>
               <w:t xml:space="preserve">Procedencia</w:t>
             </w:r>
           </w:p>
@@ -175,9 +146,6 @@
               <w:jc w:val="left"/>
             </w:pPr>
             <w:r>
-              <w:rPr>
-                <w:b/>
-              </w:rPr>
               <w:t xml:space="preserve">Qué se tomó de ahí</w:t>
             </w:r>
           </w:p>
@@ -764,9 +732,6 @@
               <w:jc w:val="left"/>
             </w:pPr>
             <w:r>
-              <w:rPr>
-                <w:b/>
-              </w:rPr>
               <w:t xml:space="preserve">Local</w:t>
             </w:r>
           </w:p>
@@ -779,15 +744,9 @@
               <w:jc w:val="left"/>
             </w:pPr>
             <w:r>
-              <w:rPr>
-                <w:b/>
-              </w:rPr>
               <w:t xml:space="preserve">7,63 × 3,56 =</w:t>
             </w:r>
             <w:r>
-              <w:rPr>
-                <w:b/>
-              </w:rPr>
               <w:t xml:space="preserve"> </w:t>
             </w:r>
             <w:r>
@@ -1086,7 +1045,7 @@
         <w:t xml:space="preserve"> </w:t>
       </w:r>
       <w:r>
-        <w:t xml:space="preserve">(0,66 y 0,22). Con los 7,57 m² reales corresponden 0,84 y 0,28. Cumple igual.</w:t>
+        <w:t xml:space="preserve">(0,66 y 0,22). Con los 8,60 m² reales (4,00 × 2,15) corresponden 0,96 y 0,32. Cumple igual.</w:t>
       </w:r>
     </w:p>
     <w:p>
@@ -1280,9 +1239,6 @@
               <w:jc w:val="left"/>
             </w:pPr>
             <w:r>
-              <w:rPr>
-                <w:b/>
-              </w:rPr>
               <w:t xml:space="preserve">Elemento</w:t>
             </w:r>
           </w:p>
@@ -1295,9 +1251,6 @@
               <w:jc w:val="left"/>
             </w:pPr>
             <w:r>
-              <w:rPr>
-                <w:b/>
-              </w:rPr>
               <w:t xml:space="preserve">Factor</w:t>
             </w:r>
           </w:p>
@@ -1310,9 +1263,6 @@
               <w:jc w:val="left"/>
             </w:pPr>
             <w:r>
-              <w:rPr>
-                <w:b/>
-              </w:rPr>
               <w:t xml:space="preserve">Unidad</w:t>
             </w:r>
           </w:p>
@@ -2069,9 +2019,6 @@
               <w:jc w:val="left"/>
             </w:pPr>
             <w:r>
-              <w:rPr>
-                <w:b/>
-              </w:rPr>
               <w:t xml:space="preserve">Qué es</w:t>
             </w:r>
           </w:p>
@@ -2084,9 +2031,6 @@
               <w:jc w:val="left"/>
             </w:pPr>
             <w:r>
-              <w:rPr>
-                <w:b/>
-              </w:rPr>
               <w:t xml:space="preserve">Valor usado</w:t>
             </w:r>
           </w:p>
@@ -2282,9 +2226,6 @@
               <w:jc w:val="left"/>
             </w:pPr>
             <w:r>
-              <w:rPr>
-                <w:b/>
-              </w:rPr>
               <w:t xml:space="preserve">Nro</w:t>
             </w:r>
           </w:p>
@@ -2297,9 +2238,6 @@
               <w:jc w:val="left"/>
             </w:pPr>
             <w:r>
-              <w:rPr>
-                <w:b/>
-              </w:rPr>
               <w:t xml:space="preserve">Descripción</w:t>
             </w:r>
           </w:p>
@@ -2312,9 +2250,6 @@
               <w:jc w:val="left"/>
             </w:pPr>
             <w:r>
-              <w:rPr>
-                <w:b/>
-              </w:rPr>
               <w:t xml:space="preserve">Dimensiones</w:t>
             </w:r>
           </w:p>
@@ -2327,9 +2262,6 @@
               <w:jc w:val="left"/>
             </w:pPr>
             <w:r>
-              <w:rPr>
-                <w:b/>
-              </w:rPr>
               <w:t xml:space="preserve">Área</w:t>
             </w:r>
           </w:p>
@@ -2342,9 +2274,6 @@
               <w:jc w:val="left"/>
             </w:pPr>
             <w:r>
-              <w:rPr>
-                <w:b/>
-              </w:rPr>
               <w:t xml:space="preserve">Factor</w:t>
             </w:r>
           </w:p>
@@ -2357,9 +2286,6 @@
               <w:jc w:val="left"/>
             </w:pPr>
             <w:r>
-              <w:rPr>
-                <w:b/>
-              </w:rPr>
               <w:t xml:space="preserve">kcal/h</w:t>
             </w:r>
           </w:p>
@@ -3778,9 +3704,6 @@
               <w:jc w:val="left"/>
             </w:pPr>
             <w:r>
-              <w:rPr>
-                <w:b/>
-              </w:rPr>
               <w:t xml:space="preserve">Local</w:t>
             </w:r>
           </w:p>
@@ -3793,9 +3716,6 @@
               <w:jc w:val="left"/>
             </w:pPr>
             <w:r>
-              <w:rPr>
-                <w:b/>
-              </w:rPr>
               <w:t xml:space="preserve">Pérdida</w:t>
             </w:r>
           </w:p>
@@ -3808,9 +3728,6 @@
               <w:jc w:val="left"/>
             </w:pPr>
             <w:r>
-              <w:rPr>
-                <w:b/>
-              </w:rPr>
               <w:t xml:space="preserve">A cubrir</w:t>
             </w:r>
           </w:p>
@@ -3823,9 +3740,6 @@
               <w:jc w:val="left"/>
             </w:pPr>
             <w:r>
-              <w:rPr>
-                <w:b/>
-              </w:rPr>
               <w:t xml:space="preserve">Emisor</w:t>
             </w:r>
           </w:p>
@@ -3914,19 +3828,19 @@
               <w:jc w:val="left"/>
             </w:pPr>
             <w:r>
-              <w:t xml:space="preserve">7.650</w:t>
-            </w:r>
-          </w:p>
-        </w:tc>
-        <w:tc>
-          <w:tcPr/>
-          <w:p>
-            <w:pPr>
-              <w:pStyle w:val="Compact"/>
-              <w:jc w:val="left"/>
-            </w:pPr>
-            <w:r>
-              <w:t xml:space="preserve">28 elementos (2 radiadores)</w:t>
+              <w:t xml:space="preserve">8.065</w:t>
+            </w:r>
+          </w:p>
+        </w:tc>
+        <w:tc>
+          <w:tcPr/>
+          <w:p>
+            <w:pPr>
+              <w:pStyle w:val="Compact"/>
+              <w:jc w:val="left"/>
+            </w:pPr>
+            <w:r>
+              <w:t xml:space="preserve">30 elementos (2 radiadores)</w:t>
             </w:r>
           </w:p>
         </w:tc>
@@ -3952,7 +3866,7 @@
               <w:jc w:val="left"/>
             </w:pPr>
             <w:r>
-              <w:t xml:space="preserve">1.924</w:t>
+              <w:t xml:space="preserve">2.340</w:t>
             </w:r>
           </w:p>
         </w:tc>
@@ -4006,19 +3920,19 @@
               <w:jc w:val="left"/>
             </w:pPr>
             <w:r>
-              <w:t xml:space="preserve">1.354</w:t>
-            </w:r>
-          </w:p>
-        </w:tc>
-        <w:tc>
-          <w:tcPr/>
-          <w:p>
-            <w:pPr>
-              <w:pStyle w:val="Compact"/>
-              <w:jc w:val="left"/>
-            </w:pPr>
-            <w:r>
-              <w:t xml:space="preserve">1.354</w:t>
+              <w:t xml:space="preserve">1.266</w:t>
+            </w:r>
+          </w:p>
+        </w:tc>
+        <w:tc>
+          <w:tcPr/>
+          <w:p>
+            <w:pPr>
+              <w:pStyle w:val="Compact"/>
+              <w:jc w:val="left"/>
+            </w:pPr>
+            <w:r>
+              <w:t xml:space="preserve">1.266</w:t>
             </w:r>
           </w:p>
         </w:tc>
@@ -4056,7 +3970,7 @@
               <w:jc w:val="left"/>
             </w:pPr>
             <w:r>
-              <w:t xml:space="preserve">1.388</w:t>
+              <w:t xml:space="preserve">1.348</w:t>
             </w:r>
           </w:p>
         </w:tc>
@@ -4310,31 +4224,31 @@
               <w:jc w:val="left"/>
             </w:pPr>
             <w:r>
-              <w:t xml:space="preserve">2.531</w:t>
-            </w:r>
-          </w:p>
-        </w:tc>
-        <w:tc>
-          <w:tcPr/>
-          <w:p>
-            <w:pPr>
-              <w:pStyle w:val="Compact"/>
-              <w:jc w:val="left"/>
-            </w:pPr>
-            <w:r>
-              <w:t xml:space="preserve">3.919</w:t>
-            </w:r>
-          </w:p>
-        </w:tc>
-        <w:tc>
-          <w:tcPr/>
-          <w:p>
-            <w:pPr>
-              <w:pStyle w:val="Compact"/>
-              <w:jc w:val="left"/>
-            </w:pPr>
-            <w:r>
-              <w:t xml:space="preserve">15 elementos</w:t>
+              <w:t xml:space="preserve">2.203</w:t>
+            </w:r>
+          </w:p>
+        </w:tc>
+        <w:tc>
+          <w:tcPr/>
+          <w:p>
+            <w:pPr>
+              <w:pStyle w:val="Compact"/>
+              <w:jc w:val="left"/>
+            </w:pPr>
+            <w:r>
+              <w:t xml:space="preserve">3.552</w:t>
+            </w:r>
+          </w:p>
+        </w:tc>
+        <w:tc>
+          <w:tcPr/>
+          <w:p>
+            <w:pPr>
+              <w:pStyle w:val="Compact"/>
+              <w:jc w:val="left"/>
+            </w:pPr>
+            <w:r>
+              <w:t xml:space="preserve">13 elementos</w:t>
             </w:r>
           </w:p>
         </w:tc>
@@ -4492,7 +4406,7 @@
                 <w:bCs/>
                 <w:b/>
               </w:rPr>
-              <w:t xml:space="preserve">95 elementos + 3 toalleros</w:t>
+              <w:t xml:space="preserve">94 elementos + 3 toalleros</w:t>
             </w:r>
           </w:p>
         </w:tc>
@@ -4559,7 +4473,7 @@
         <w:t xml:space="preserve"> </w:t>
       </w:r>
       <w:r>
-        <w:t xml:space="preserve">tiene 10,56 m² de vidrio y la escalera el paño fijo PF05. Como están abiertos a</w:t>
+        <w:t xml:space="preserve">tiene 10,65 m² de vidrio y la puerta de ingreso H01 y la escalera el paño fijo PF05. Como están abiertos a</w:t>
       </w:r>
       <w:r>
         <w:t xml:space="preserve"> </w:t>
@@ -4668,7 +4582,7 @@
     </w:p>
     <w:bookmarkEnd w:id="37"/>
     <w:bookmarkEnd w:id="38"/>
-    <w:bookmarkStart w:id="46" w:name="puntos-a-explicar-en-la-defensa"/>
+    <w:bookmarkStart w:id="47" w:name="puntos-a-explicar-en-la-defensa"/>
     <w:p>
       <w:pPr>
         <w:pStyle w:val="Heading1"/>
@@ -6176,6 +6090,677 @@
         <w:t xml:space="preserve">en el dormitorio sur. Conviene borrar ese bloque del plano.</w:t>
       </w:r>
     </w:p>
+    <w:bookmarkEnd w:id="45"/>
+    <w:bookmarkStart w:id="46" w:name="X334772fdcdbdddec7f482e3ed3ad0e52a686504"/>
+    <w:p>
+      <w:pPr>
+        <w:pStyle w:val="Heading2"/>
+      </w:pPr>
+      <w:r>
+        <w:t xml:space="preserve">3.8 Balance térmico: lo que conviene poder explicar</w:t>
+      </w:r>
+    </w:p>
+    <w:p>
+      <w:pPr>
+        <w:pStyle w:val="FirstParagraph"/>
+      </w:pPr>
+      <w:r>
+        <w:rPr>
+          <w:bCs/>
+          <w:b/>
+        </w:rPr>
+        <w:t xml:space="preserve">Qué significa la orientación de una pared.</w:t>
+      </w:r>
+      <w:r>
+        <w:t xml:space="preserve"> </w:t>
+      </w:r>
+      <w:r>
+        <w:t xml:space="preserve">Es hacia dónde mira la pared</w:t>
+      </w:r>
+      <w:r>
+        <w:t xml:space="preserve"> </w:t>
+      </w:r>
+      <w:r>
+        <w:t xml:space="preserve">parada adentro del local: el punto cardinal del lado de afuera. En una pared</w:t>
+      </w:r>
+      <w:r>
+        <w:t xml:space="preserve"> </w:t>
+      </w:r>
+      <w:r>
+        <w:t xml:space="preserve">exterior coincide con la fachada. En una</w:t>
+      </w:r>
+      <w:r>
+        <w:t xml:space="preserve"> </w:t>
+      </w:r>
+      <w:r>
+        <w:rPr>
+          <w:bCs/>
+          <w:b/>
+        </w:rPr>
+        <w:t xml:space="preserve">interior</w:t>
+      </w:r>
+      <w:r>
+        <w:t xml:space="preserve">, la misma pared tiene dos</w:t>
+      </w:r>
+      <w:r>
+        <w:t xml:space="preserve"> </w:t>
+      </w:r>
+      <w:r>
+        <w:t xml:space="preserve">caras, una por local, con orientaciones opuestas: la pared que el hall ve al NE</w:t>
+      </w:r>
+      <w:r>
+        <w:t xml:space="preserve"> </w:t>
+      </w:r>
+      <w:r>
+        <w:t xml:space="preserve">es la que el vestidor ve al SO.</w:t>
+      </w:r>
+    </w:p>
+    <w:p>
+      <w:pPr>
+        <w:pStyle w:val="BodyText"/>
+      </w:pPr>
+      <w:r>
+        <w:rPr>
+          <w:bCs/>
+          <w:b/>
+        </w:rPr>
+        <w:t xml:space="preserve">Qué lleva el rótulo de cada pared.</w:t>
+      </w:r>
+      <w:r>
+        <w:t xml:space="preserve"> </w:t>
+      </w:r>
+      <w:r>
+        <w:t xml:space="preserve">Aisladas: sólo la orientación, por</w:t>
+      </w:r>
+      <w:r>
+        <w:t xml:space="preserve"> </w:t>
+      </w:r>
+      <w:r>
+        <w:t xml:space="preserve">ejemplo</w:t>
+      </w:r>
+      <w:r>
+        <w:t xml:space="preserve"> </w:t>
+      </w:r>
+      <w:r>
+        <w:rPr>
+          <w:rStyle w:val="VerbatimChar"/>
+        </w:rPr>
+        <w:t xml:space="preserve">AISLADAS (NO)</w:t>
+      </w:r>
+      <w:r>
+        <w:t xml:space="preserve">. Interiores: orientación y local con el que lindan, por</w:t>
+      </w:r>
+      <w:r>
+        <w:t xml:space="preserve"> </w:t>
+      </w:r>
+      <w:r>
+        <w:t xml:space="preserve">ejemplo</w:t>
+      </w:r>
+      <w:r>
+        <w:t xml:space="preserve"> </w:t>
+      </w:r>
+      <w:r>
+        <w:rPr>
+          <w:rStyle w:val="VerbatimChar"/>
+        </w:rPr>
+        <w:t xml:space="preserve">INTERIORES (NE, cocina)</w:t>
+      </w:r>
+      <w:r>
+        <w:t xml:space="preserve">. No se escribe la abertura.</w:t>
+      </w:r>
+    </w:p>
+    <w:p>
+      <w:pPr>
+        <w:pStyle w:val="BodyText"/>
+      </w:pPr>
+      <w:r>
+        <w:rPr>
+          <w:bCs/>
+          <w:b/>
+        </w:rPr>
+        <w:t xml:space="preserve">Por qué aparecen tres renglones de techo (y dos de piso).</w:t>
+      </w:r>
+      <w:r>
+        <w:t xml:space="preserve"> </w:t>
+      </w:r>
+      <w:r>
+        <w:t xml:space="preserve">Es el formulario de</w:t>
+      </w:r>
+      <w:r>
+        <w:t xml:space="preserve"> </w:t>
+      </w:r>
+      <w:r>
+        <w:t xml:space="preserve">la cátedra, que trae impresas todas las opciones y se completa sólo la que</w:t>
+      </w:r>
+      <w:r>
+        <w:t xml:space="preserve"> </w:t>
+      </w:r>
+      <w:r>
+        <w:t xml:space="preserve">corresponde. En planta baja corresponde</w:t>
+      </w:r>
+      <w:r>
+        <w:t xml:space="preserve"> </w:t>
+      </w:r>
+      <w:r>
+        <w:rPr>
+          <w:bCs/>
+          <w:b/>
+        </w:rPr>
+        <w:t xml:space="preserve">techo entrepiso</w:t>
+      </w:r>
+      <w:r>
+        <w:t xml:space="preserve"> </w:t>
+      </w:r>
+      <w:r>
+        <w:t xml:space="preserve">(factor 15, porque</w:t>
+      </w:r>
+      <w:r>
+        <w:t xml:space="preserve"> </w:t>
+      </w:r>
+      <w:r>
+        <w:t xml:space="preserve">arriba hay otro local calefaccionado) y</w:t>
+      </w:r>
+      <w:r>
+        <w:t xml:space="preserve"> </w:t>
+      </w:r>
+      <w:r>
+        <w:rPr>
+          <w:bCs/>
+          <w:b/>
+        </w:rPr>
+        <w:t xml:space="preserve">piso sobre tierra</w:t>
+      </w:r>
+      <w:r>
+        <w:t xml:space="preserve"> </w:t>
+      </w:r>
+      <w:r>
+        <w:t xml:space="preserve">(10). En planta alta,</w:t>
+      </w:r>
+      <w:r>
+        <w:t xml:space="preserve"> </w:t>
+      </w:r>
+      <w:r>
+        <w:rPr>
+          <w:bCs/>
+          <w:b/>
+        </w:rPr>
+        <w:t xml:space="preserve">techo aislado</w:t>
+      </w:r>
+      <w:r>
+        <w:t xml:space="preserve"> </w:t>
+      </w:r>
+      <w:r>
+        <w:t xml:space="preserve">(20, cubierta con aislación) y</w:t>
+      </w:r>
+      <w:r>
+        <w:t xml:space="preserve"> </w:t>
+      </w:r>
+      <w:r>
+        <w:rPr>
+          <w:bCs/>
+          <w:b/>
+        </w:rPr>
+        <w:t xml:space="preserve">piso sobre local ocupado</w:t>
+      </w:r>
+      <w:r>
+        <w:t xml:space="preserve"> </w:t>
+      </w:r>
+      <w:r>
+        <w:t xml:space="preserve">(15).</w:t>
+      </w:r>
+      <w:r>
+        <w:t xml:space="preserve"> </w:t>
+      </w:r>
+      <w:r>
+        <w:t xml:space="preserve">La misma losa de 12 cm es techo entrepiso abajo y piso sobre local ocupado</w:t>
+      </w:r>
+      <w:r>
+        <w:t xml:space="preserve"> </w:t>
+      </w:r>
+      <w:r>
+        <w:t xml:space="preserve">arriba.</w:t>
+      </w:r>
+    </w:p>
+    <w:p>
+      <w:pPr>
+        <w:pStyle w:val="BodyText"/>
+      </w:pPr>
+      <w:r>
+        <w:rPr>
+          <w:bCs/>
+          <w:b/>
+        </w:rPr>
+        <w:t xml:space="preserve">Paredes enteras, sin descontar aberturas.</w:t>
+      </w:r>
+      <w:r>
+        <w:t xml:space="preserve"> </w:t>
+      </w:r>
+      <w:r>
+        <w:t xml:space="preserve">El método de la cátedra computa</w:t>
+      </w:r>
+      <w:r>
+        <w:t xml:space="preserve"> </w:t>
+      </w:r>
+      <w:r>
+        <w:t xml:space="preserve">cada pared completa y suma la abertura aparte (factor 60). Así lo hace el</w:t>
+      </w:r>
+      <w:r>
+        <w:t xml:space="preserve"> </w:t>
+      </w:r>
+      <w:r>
+        <w:t xml:space="preserve">formulario modelo y así se hizo en todos los locales.</w:t>
+      </w:r>
+    </w:p>
+    <w:p>
+      <w:pPr>
+        <w:pStyle w:val="BodyText"/>
+      </w:pPr>
+      <w:r>
+        <w:rPr>
+          <w:bCs/>
+          <w:b/>
+        </w:rPr>
+        <w:t xml:space="preserve">Aislada o interior.</w:t>
+      </w:r>
+      <w:r>
+        <w:t xml:space="preserve"> </w:t>
+      </w:r>
+      <w:r>
+        <w:t xml:space="preserve">Aislada es la que da al exterior (factor 20, paquete con</w:t>
+      </w:r>
+      <w:r>
+        <w:t xml:space="preserve"> </w:t>
+      </w:r>
+      <w:r>
+        <w:t xml:space="preserve">25 mm de EPS). Interior es la que da a otro local (factor 25). El factor de la</w:t>
+      </w:r>
+      <w:r>
+        <w:t xml:space="preserve"> </w:t>
+      </w:r>
+      <w:r>
+        <w:t xml:space="preserve">interior es mayor que el de la aislada porque se la supone sin aislación.</w:t>
+      </w:r>
+    </w:p>
+    <w:p>
+      <w:pPr>
+        <w:pStyle w:val="BodyText"/>
+      </w:pPr>
+      <w:r>
+        <w:rPr>
+          <w:bCs/>
+          <w:b/>
+        </w:rPr>
+        <w:t xml:space="preserve">Dos locales sin radiador.</w:t>
+      </w:r>
+      <w:r>
+        <w:t xml:space="preserve"> </w:t>
+      </w:r>
+      <w:r>
+        <w:t xml:space="preserve">El</w:t>
+      </w:r>
+      <w:r>
+        <w:t xml:space="preserve"> </w:t>
+      </w:r>
+      <w:r>
+        <w:rPr>
+          <w:bCs/>
+          <w:b/>
+        </w:rPr>
+        <w:t xml:space="preserve">hall</w:t>
+      </w:r>
+      <w:r>
+        <w:t xml:space="preserve"> </w:t>
+      </w:r>
+      <w:r>
+        <w:t xml:space="preserve">se suma al living y la</w:t>
+      </w:r>
+      <w:r>
+        <w:t xml:space="preserve"> </w:t>
+      </w:r>
+      <w:r>
+        <w:rPr>
+          <w:bCs/>
+          <w:b/>
+        </w:rPr>
+        <w:t xml:space="preserve">escalera</w:t>
+      </w:r>
+      <w:r>
+        <w:t xml:space="preserve"> </w:t>
+      </w:r>
+      <w:r>
+        <w:t xml:space="preserve">al</w:t>
+      </w:r>
+      <w:r>
+        <w:t xml:space="preserve"> </w:t>
+      </w:r>
+      <w:r>
+        <w:t xml:space="preserve">play room, porque están abiertos a ellos y el aire es el mismo. El radiador se</w:t>
+      </w:r>
+      <w:r>
+        <w:t xml:space="preserve"> </w:t>
+      </w:r>
+      <w:r>
+        <w:t xml:space="preserve">dimensiona con el total, que figura en cada bloque como</w:t>
+      </w:r>
+      <w:r>
+        <w:t xml:space="preserve"> </w:t>
+      </w:r>
+      <w:r>
+        <w:t xml:space="preserve">“</w:t>
+      </w:r>
+      <w:r>
+        <w:t xml:space="preserve">CARGA TOTAL A CUBRIR</w:t>
+      </w:r>
+      <w:r>
+        <w:t xml:space="preserve">”</w:t>
+      </w:r>
+      <w:r>
+        <w:t xml:space="preserve">.</w:t>
+      </w:r>
+    </w:p>
+    <w:p>
+      <w:pPr>
+        <w:pStyle w:val="BodyText"/>
+      </w:pPr>
+      <w:r>
+        <w:rPr>
+          <w:bCs/>
+          <w:b/>
+        </w:rPr>
+        <w:t xml:space="preserve">Baranda de la escalera, play room.</w:t>
+      </w:r>
+      <w:r>
+        <w:t xml:space="preserve"> </w:t>
+      </w:r>
+      <w:r>
+        <w:t xml:space="preserve">Una de las paredes de 4,08 m del play room</w:t>
+      </w:r>
+      <w:r>
+        <w:t xml:space="preserve"> </w:t>
+      </w:r>
+      <w:r>
+        <w:t xml:space="preserve">es una baranda, no un muro. No se cuenta como pared: entre el play room y la</w:t>
+      </w:r>
+      <w:r>
+        <w:t xml:space="preserve"> </w:t>
+      </w:r>
+      <w:r>
+        <w:t xml:space="preserve">escalera hay un solo ambiente.</w:t>
+      </w:r>
+    </w:p>
+    <w:p>
+      <w:pPr>
+        <w:pStyle w:val="BodyText"/>
+      </w:pPr>
+      <w:r>
+        <w:rPr>
+          <w:bCs/>
+          <w:b/>
+        </w:rPr>
+        <w:t xml:space="preserve">Pared del living a la escalera.</w:t>
+      </w:r>
+      <w:r>
+        <w:t xml:space="preserve"> </w:t>
+      </w:r>
+      <w:r>
+        <w:t xml:space="preserve">Llega hasta la losa, sobre el baño exterior</w:t>
+      </w:r>
+      <w:r>
+        <w:t xml:space="preserve"> </w:t>
+      </w:r>
+      <w:r>
+        <w:t xml:space="preserve">(12) que está bajo la escalera. Se cuenta como muro completo.</w:t>
+      </w:r>
+    </w:p>
+    <w:p>
+      <w:pPr>
+        <w:pStyle w:val="BodyText"/>
+      </w:pPr>
+      <w:r>
+        <w:rPr>
+          <w:bCs/>
+          <w:b/>
+        </w:rPr>
+        <w:t xml:space="preserve">Hall: la puerta de ingreso H01.</w:t>
+      </w:r>
+      <w:r>
+        <w:t xml:space="preserve"> </w:t>
+      </w:r>
+      <w:r>
+        <w:t xml:space="preserve">Mide 1,50 × 3,00 y está en la planilla de</w:t>
+      </w:r>
+      <w:r>
+        <w:t xml:space="preserve"> </w:t>
+      </w:r>
+      <w:r>
+        <w:t xml:space="preserve">herrería, no en la de carpintería. Se computó como abertura con factor 60. Si</w:t>
+      </w:r>
+      <w:r>
+        <w:t xml:space="preserve"> </w:t>
+      </w:r>
+      <w:r>
+        <w:t xml:space="preserve">fuera una puerta ciega de chapa convendría revisar el factor.</w:t>
+      </w:r>
+    </w:p>
+    <w:p>
+      <w:pPr>
+        <w:pStyle w:val="BodyText"/>
+      </w:pPr>
+      <w:r>
+        <w:rPr>
+          <w:bCs/>
+          <w:b/>
+        </w:rPr>
+        <w:t xml:space="preserve">Vestidor.</w:t>
+      </w:r>
+      <w:r>
+        <w:t xml:space="preserve"> </w:t>
+      </w:r>
+      <w:r>
+        <w:t xml:space="preserve">Es en L: el lado largo de 4,87 se separa en 1,70 exterior y 3,17</w:t>
+      </w:r>
+      <w:r>
+        <w:t xml:space="preserve"> </w:t>
+      </w:r>
+      <w:r>
+        <w:t xml:space="preserve">interior (hacia el hall), y del lado opuesto hay tres tramos cortos (3,38, 0,57 y</w:t>
+      </w:r>
+      <w:r>
+        <w:t xml:space="preserve"> </w:t>
+      </w:r>
+      <w:r>
+        <w:t xml:space="preserve">1,49). El extremo de 1,09</w:t>
+      </w:r>
+      <w:r>
+        <w:t xml:space="preserve"> </w:t>
+      </w:r>
+      <w:r>
+        <w:rPr>
+          <w:bCs/>
+          <w:b/>
+        </w:rPr>
+        <w:t xml:space="preserve">no tiene pared</w:t>
+      </w:r>
+      <w:r>
+        <w:t xml:space="preserve">: se entra sin puerta, así que no se</w:t>
+      </w:r>
+      <w:r>
+        <w:t xml:space="preserve"> </w:t>
+      </w:r>
+      <w:r>
+        <w:t xml:space="preserve">computa.</w:t>
+      </w:r>
+    </w:p>
+    <w:p>
+      <w:pPr>
+        <w:pStyle w:val="BodyText"/>
+      </w:pPr>
+      <w:r>
+        <w:rPr>
+          <w:bCs/>
+          <w:b/>
+        </w:rPr>
+        <w:t xml:space="preserve">Cosas para chequear antes de la defensa.</w:t>
+      </w:r>
+    </w:p>
+    <w:p>
+      <w:pPr>
+        <w:numPr>
+          <w:ilvl w:val="0"/>
+          <w:numId w:val="1007"/>
+        </w:numPr>
+        <w:pStyle w:val="Compact"/>
+      </w:pPr>
+      <w:r>
+        <w:t xml:space="preserve">El hall comparte con el vestidor una pared de</w:t>
+      </w:r>
+      <w:r>
+        <w:t xml:space="preserve"> </w:t>
+      </w:r>
+      <w:r>
+        <w:rPr>
+          <w:bCs/>
+          <w:b/>
+        </w:rPr>
+        <w:t xml:space="preserve">4,00</w:t>
+      </w:r>
+      <w:r>
+        <w:t xml:space="preserve">, pero el tramo interior</w:t>
+      </w:r>
+      <w:r>
+        <w:t xml:space="preserve"> </w:t>
+      </w:r>
+      <w:r>
+        <w:t xml:space="preserve">del vestidor que da al hall es de</w:t>
+      </w:r>
+      <w:r>
+        <w:t xml:space="preserve"> </w:t>
+      </w:r>
+      <w:r>
+        <w:rPr>
+          <w:bCs/>
+          <w:b/>
+        </w:rPr>
+        <w:t xml:space="preserve">3,17</w:t>
+      </w:r>
+      <w:r>
+        <w:t xml:space="preserve">. No coinciden: conviene mirar el plano.</w:t>
+      </w:r>
+    </w:p>
+    <w:p>
+      <w:pPr>
+        <w:numPr>
+          <w:ilvl w:val="0"/>
+          <w:numId w:val="1007"/>
+        </w:numPr>
+        <w:pStyle w:val="Compact"/>
+      </w:pPr>
+      <w:r>
+        <w:t xml:space="preserve">Las</w:t>
+      </w:r>
+      <w:r>
+        <w:t xml:space="preserve"> </w:t>
+      </w:r>
+      <w:r>
+        <w:rPr>
+          <w:bCs/>
+          <w:b/>
+        </w:rPr>
+        <w:t xml:space="preserve">superficies</w:t>
+      </w:r>
+      <w:r>
+        <w:t xml:space="preserve"> </w:t>
+      </w:r>
+      <w:r>
+        <w:t xml:space="preserve">de los croquis no cierran del todo con las de la planilla.</w:t>
+      </w:r>
+      <w:r>
+        <w:t xml:space="preserve"> </w:t>
+      </w:r>
+      <w:r>
+        <w:t xml:space="preserve">La más dudosa es la escalera: la planilla usa 7,02 m² (del detalle</w:t>
+      </w:r>
+      <w:r>
+        <w:t xml:space="preserve"> </w:t>
+      </w:r>
+      <w:r>
+        <w:t xml:space="preserve">estructural) y la polilínea da unos 4,6 m².</w:t>
+      </w:r>
+    </w:p>
+    <w:p>
+      <w:pPr>
+        <w:numPr>
+          <w:ilvl w:val="0"/>
+          <w:numId w:val="1007"/>
+        </w:numPr>
+        <w:pStyle w:val="Compact"/>
+      </w:pPr>
+      <w:r>
+        <w:t xml:space="preserve">En la lámina de fachadas la</w:t>
+      </w:r>
+      <w:r>
+        <w:t xml:space="preserve"> </w:t>
+      </w:r>
+      <w:r>
+        <w:rPr>
+          <w:bCs/>
+          <w:b/>
+        </w:rPr>
+        <w:t xml:space="preserve">PF05 de la escalera</w:t>
+      </w:r>
+      <w:r>
+        <w:t xml:space="preserve"> </w:t>
+      </w:r>
+      <w:r>
+        <w:t xml:space="preserve">figura al NE, pero el lado</w:t>
+      </w:r>
+      <w:r>
+        <w:t xml:space="preserve"> </w:t>
+      </w:r>
+      <w:r>
+        <w:t xml:space="preserve">NE de la escalera quedó cargado como pared interior. Revisar.</w:t>
+      </w:r>
+    </w:p>
+    <w:p>
+      <w:pPr>
+        <w:numPr>
+          <w:ilvl w:val="0"/>
+          <w:numId w:val="1007"/>
+        </w:numPr>
+        <w:pStyle w:val="Compact"/>
+      </w:pPr>
+      <w:r>
+        <w:t xml:space="preserve">Quedan</w:t>
+      </w:r>
+      <w:r>
+        <w:t xml:space="preserve"> </w:t>
+      </w:r>
+      <w:r>
+        <w:rPr>
+          <w:bCs/>
+          <w:b/>
+        </w:rPr>
+        <w:t xml:space="preserve">orientaciones sin completar</w:t>
+      </w:r>
+      <w:r>
+        <w:t xml:space="preserve"> </w:t>
+      </w:r>
+      <w:r>
+        <w:t xml:space="preserve">en la escalera (las dos de 4,06), el</w:t>
+      </w:r>
+      <w:r>
+        <w:t xml:space="preserve"> </w:t>
+      </w:r>
+      <w:r>
+        <w:t xml:space="preserve">baño de visitas, y los dormitorios Norte y Sur y el baño 17 (la pared ciega y</w:t>
+      </w:r>
+      <w:r>
+        <w:t xml:space="preserve"> </w:t>
+      </w:r>
+      <w:r>
+        <w:t xml:space="preserve">la interior de cada uno).</w:t>
+      </w:r>
+    </w:p>
     <w:p>
       <w:r>
         <w:pict>
@@ -6183,9 +6768,9 @@
         </w:pict>
       </w:r>
     </w:p>
-    <w:bookmarkEnd w:id="45"/>
     <w:bookmarkEnd w:id="46"/>
-    <w:bookmarkStart w:id="47" w:name="resumen-de-verificaciones"/>
+    <w:bookmarkEnd w:id="47"/>
+    <w:bookmarkStart w:id="48" w:name="resumen-de-verificaciones"/>
     <w:p>
       <w:pPr>
         <w:pStyle w:val="Heading1"/>
@@ -6217,9 +6802,6 @@
               <w:jc w:val="left"/>
             </w:pPr>
             <w:r>
-              <w:rPr>
-                <w:b/>
-              </w:rPr>
               <w:t xml:space="preserve">Planilla</w:t>
             </w:r>
           </w:p>
@@ -6232,9 +6814,6 @@
               <w:jc w:val="left"/>
             </w:pPr>
             <w:r>
-              <w:rPr>
-                <w:b/>
-              </w:rPr>
               <w:t xml:space="preserve">Verifican</w:t>
             </w:r>
           </w:p>
@@ -6516,7 +7095,7 @@
         <w:t xml:space="preserve">.</w:t>
       </w:r>
     </w:p>
-    <w:bookmarkEnd w:id="47"/>
+    <w:bookmarkEnd w:id="48"/>
     <w:sectPr/>
   </w:body>
 </w:document>
@@ -6886,6 +7465,9 @@
       <w:startOverride w:val="1"/>
     </w:lvlOverride>
   </w:num>
+  <w:num w:numId="1007">
+    <w:abstractNumId w:val="991"/>
+  </w:num>
 </w:numbering>
 </file>
 
@@ -6911,7 +7493,7 @@
     <w:name w:val="Normal"/>
     <w:qFormat/>
     <w:rPr>
-      <w:rFonts w:ascii="Bahnschrift Light Condensed" w:hAnsi="Bahnschrift Light Condensed" w:cs="Bahnschrift Light Condensed" w:eastAsia="Bahnschrift Light Condensed"/>
+      <w:rFonts w:ascii="Bahnschrift Light Condensed" w:cs="Bahnschrift Light Condensed" w:eastAsia="Bahnschrift Light Condensed" w:hAnsi="Bahnschrift Light Condensed"/>
       <w:sz w:val="22"/>
     </w:rPr>
   </w:style>
@@ -6924,7 +7506,7 @@
     </w:pPr>
     <w:qFormat/>
     <w:rPr>
-      <w:rFonts w:ascii="Bahnschrift Light Condensed" w:hAnsi="Bahnschrift Light Condensed" w:cs="Bahnschrift Light Condensed" w:eastAsia="Bahnschrift Light Condensed"/>
+      <w:rFonts w:ascii="Bahnschrift Light Condensed" w:cs="Bahnschrift Light Condensed" w:eastAsia="Bahnschrift Light Condensed" w:hAnsi="Bahnschrift Light Condensed"/>
     </w:rPr>
   </w:style>
   <w:style w:customStyle="1" w:styleId="FirstParagraph" w:type="paragraph">
@@ -6933,7 +7515,7 @@
     <w:next w:val="BodyText"/>
     <w:qFormat/>
     <w:rPr>
-      <w:rFonts w:ascii="Bahnschrift Light Condensed" w:hAnsi="Bahnschrift Light Condensed" w:cs="Bahnschrift Light Condensed" w:eastAsia="Bahnschrift Light Condensed"/>
+      <w:rFonts w:ascii="Bahnschrift Light Condensed" w:cs="Bahnschrift Light Condensed" w:eastAsia="Bahnschrift Light Condensed" w:hAnsi="Bahnschrift Light Condensed"/>
     </w:rPr>
   </w:style>
   <w:style w:customStyle="1" w:styleId="Compact" w:type="paragraph">
@@ -6944,7 +7526,7 @@
       <w:spacing w:after="36" w:before="36"/>
     </w:pPr>
     <w:rPr>
-      <w:rFonts w:ascii="Bahnschrift Light Condensed" w:hAnsi="Bahnschrift Light Condensed" w:cs="Bahnschrift Light Condensed" w:eastAsia="Bahnschrift Light Condensed"/>
+      <w:rFonts w:ascii="Bahnschrift Light Condensed" w:cs="Bahnschrift Light Condensed" w:eastAsia="Bahnschrift Light Condensed" w:hAnsi="Bahnschrift Light Condensed"/>
     </w:rPr>
   </w:style>
   <w:style w:styleId="Title" w:type="paragraph">
@@ -7265,7 +7847,7 @@
     <w:unhideWhenUsed/>
     <w:qFormat/>
     <w:rPr>
-      <w:rFonts w:ascii="Bahnschrift Light Condensed" w:hAnsi="Bahnschrift Light Condensed" w:cs="Bahnschrift Light Condensed" w:eastAsia="Bahnschrift Light Condensed"/>
+      <w:rFonts w:ascii="Bahnschrift Light Condensed" w:cs="Bahnschrift Light Condensed" w:eastAsia="Bahnschrift Light Condensed" w:hAnsi="Bahnschrift Light Condensed"/>
     </w:rPr>
     <w:tblPr>
       <w:tblInd w:type="dxa" w:w="0"/>
@@ -7351,7 +7933,7 @@
     <w:name w:val="Verbatim Char"/>
     <w:basedOn w:val="BodyTextChar"/>
     <w:rPr>
-      <w:rFonts w:ascii="Bahnschrift Light Condensed" w:hAnsi="Bahnschrift Light Condensed" w:cs="Bahnschrift Light Condensed" w:eastAsia="Bahnschrift Light Condensed"/>
+      <w:rFonts w:ascii="Bahnschrift Light Condensed" w:cs="Bahnschrift Light Condensed" w:eastAsia="Bahnschrift Light Condensed" w:hAnsi="Bahnschrift Light Condensed"/>
       <w:sz w:val="22"/>
     </w:rPr>
   </w:style>
@@ -7391,7 +7973,7 @@
       <w:color w:themeColor="accent1" w:themeShade="BF" w:val="365F91"/>
     </w:rPr>
   </w:style>
-  <w:style w:type="paragraph" w:customStyle="1" w:styleId="SourceCode">
+  <w:style w:customStyle="1" w:styleId="SourceCode" w:type="paragraph">
     <w:name w:val="Source Code"/>
     <w:basedOn w:val="Normal"/>
     <w:link w:val="VerbatimChar"/>
@@ -7399,10 +7981,10 @@
       <w:wordWrap w:val="off"/>
     </w:pPr>
     <w:rPr>
-      <w:rFonts w:ascii="Bahnschrift Light Condensed" w:hAnsi="Bahnschrift Light Condensed" w:cs="Bahnschrift Light Condensed" w:eastAsia="Bahnschrift Light Condensed"/>
+      <w:rFonts w:ascii="Bahnschrift Light Condensed" w:cs="Bahnschrift Light Condensed" w:eastAsia="Bahnschrift Light Condensed" w:hAnsi="Bahnschrift Light Condensed"/>
     </w:rPr>
   </w:style>
-  <w:style w:type="character" w:customStyle="1" w:styleId="KeywordTok">
+  <w:style w:customStyle="1" w:styleId="KeywordTok" w:type="character">
     <w:name w:val="KeywordTok"/>
     <w:basedOn w:val="VerbatimChar"/>
     <w:rPr>
@@ -7410,77 +7992,77 @@
       <w:b/>
     </w:rPr>
   </w:style>
-  <w:style w:type="character" w:customStyle="1" w:styleId="DataTypeTok">
+  <w:style w:customStyle="1" w:styleId="DataTypeTok" w:type="character">
     <w:name w:val="DataTypeTok"/>
     <w:basedOn w:val="VerbatimChar"/>
     <w:rPr>
       <w:color w:val="902000"/>
     </w:rPr>
   </w:style>
-  <w:style w:type="character" w:customStyle="1" w:styleId="DecValTok">
+  <w:style w:customStyle="1" w:styleId="DecValTok" w:type="character">
     <w:name w:val="DecValTok"/>
     <w:basedOn w:val="VerbatimChar"/>
     <w:rPr>
       <w:color w:val="40a070"/>
     </w:rPr>
   </w:style>
-  <w:style w:type="character" w:customStyle="1" w:styleId="BaseNTok">
+  <w:style w:customStyle="1" w:styleId="BaseNTok" w:type="character">
     <w:name w:val="BaseNTok"/>
     <w:basedOn w:val="VerbatimChar"/>
     <w:rPr>
       <w:color w:val="40a070"/>
     </w:rPr>
   </w:style>
-  <w:style w:type="character" w:customStyle="1" w:styleId="FloatTok">
+  <w:style w:customStyle="1" w:styleId="FloatTok" w:type="character">
     <w:name w:val="FloatTok"/>
     <w:basedOn w:val="VerbatimChar"/>
     <w:rPr>
       <w:color w:val="40a070"/>
     </w:rPr>
   </w:style>
-  <w:style w:type="character" w:customStyle="1" w:styleId="ConstantTok">
+  <w:style w:customStyle="1" w:styleId="ConstantTok" w:type="character">
     <w:name w:val="ConstantTok"/>
     <w:basedOn w:val="VerbatimChar"/>
     <w:rPr>
       <w:color w:val="880000"/>
     </w:rPr>
   </w:style>
-  <w:style w:type="character" w:customStyle="1" w:styleId="CharTok">
+  <w:style w:customStyle="1" w:styleId="CharTok" w:type="character">
     <w:name w:val="CharTok"/>
     <w:basedOn w:val="VerbatimChar"/>
     <w:rPr>
       <w:color w:val="4070a0"/>
     </w:rPr>
   </w:style>
-  <w:style w:type="character" w:customStyle="1" w:styleId="SpecialCharTok">
+  <w:style w:customStyle="1" w:styleId="SpecialCharTok" w:type="character">
     <w:name w:val="SpecialCharTok"/>
     <w:basedOn w:val="VerbatimChar"/>
     <w:rPr>
       <w:color w:val="4070a0"/>
     </w:rPr>
   </w:style>
-  <w:style w:type="character" w:customStyle="1" w:styleId="StringTok">
+  <w:style w:customStyle="1" w:styleId="StringTok" w:type="character">
     <w:name w:val="StringTok"/>
     <w:basedOn w:val="VerbatimChar"/>
     <w:rPr>
       <w:color w:val="4070a0"/>
     </w:rPr>
   </w:style>
-  <w:style w:type="character" w:customStyle="1" w:styleId="VerbatimStringTok">
+  <w:style w:customStyle="1" w:styleId="VerbatimStringTok" w:type="character">
     <w:name w:val="VerbatimStringTok"/>
     <w:basedOn w:val="VerbatimChar"/>
     <w:rPr>
       <w:color w:val="4070a0"/>
     </w:rPr>
   </w:style>
-  <w:style w:type="character" w:customStyle="1" w:styleId="SpecialStringTok">
+  <w:style w:customStyle="1" w:styleId="SpecialStringTok" w:type="character">
     <w:name w:val="SpecialStringTok"/>
     <w:basedOn w:val="VerbatimChar"/>
     <w:rPr>
       <w:color w:val="bb6688"/>
     </w:rPr>
   </w:style>
-  <w:style w:type="character" w:customStyle="1" w:styleId="ImportTok">
+  <w:style w:customStyle="1" w:styleId="ImportTok" w:type="character">
     <w:name w:val="ImportTok"/>
     <w:basedOn w:val="VerbatimChar"/>
     <w:rPr>
@@ -7488,7 +8070,7 @@
       <w:b/>
     </w:rPr>
   </w:style>
-  <w:style w:type="character" w:customStyle="1" w:styleId="CommentTok">
+  <w:style w:customStyle="1" w:styleId="CommentTok" w:type="character">
     <w:name w:val="CommentTok"/>
     <w:basedOn w:val="VerbatimChar"/>
     <w:rPr>
@@ -7496,7 +8078,7 @@
       <w:i/>
     </w:rPr>
   </w:style>
-  <w:style w:type="character" w:customStyle="1" w:styleId="DocumentationTok">
+  <w:style w:customStyle="1" w:styleId="DocumentationTok" w:type="character">
     <w:name w:val="DocumentationTok"/>
     <w:basedOn w:val="VerbatimChar"/>
     <w:rPr>
@@ -7504,7 +8086,7 @@
       <w:i/>
     </w:rPr>
   </w:style>
-  <w:style w:type="character" w:customStyle="1" w:styleId="AnnotationTok">
+  <w:style w:customStyle="1" w:styleId="AnnotationTok" w:type="character">
     <w:name w:val="AnnotationTok"/>
     <w:basedOn w:val="VerbatimChar"/>
     <w:rPr>
@@ -7513,7 +8095,7 @@
       <w:i/>
     </w:rPr>
   </w:style>
-  <w:style w:type="character" w:customStyle="1" w:styleId="CommentVarTok">
+  <w:style w:customStyle="1" w:styleId="CommentVarTok" w:type="character">
     <w:name w:val="CommentVarTok"/>
     <w:basedOn w:val="VerbatimChar"/>
     <w:rPr>
@@ -7522,28 +8104,28 @@
       <w:i/>
     </w:rPr>
   </w:style>
-  <w:style w:type="character" w:customStyle="1" w:styleId="OtherTok">
+  <w:style w:customStyle="1" w:styleId="OtherTok" w:type="character">
     <w:name w:val="OtherTok"/>
     <w:basedOn w:val="VerbatimChar"/>
     <w:rPr>
       <w:color w:val="007020"/>
     </w:rPr>
   </w:style>
-  <w:style w:type="character" w:customStyle="1" w:styleId="FunctionTok">
+  <w:style w:customStyle="1" w:styleId="FunctionTok" w:type="character">
     <w:name w:val="FunctionTok"/>
     <w:basedOn w:val="VerbatimChar"/>
     <w:rPr>
       <w:color w:val="06287e"/>
     </w:rPr>
   </w:style>
-  <w:style w:type="character" w:customStyle="1" w:styleId="VariableTok">
+  <w:style w:customStyle="1" w:styleId="VariableTok" w:type="character">
     <w:name w:val="VariableTok"/>
     <w:basedOn w:val="VerbatimChar"/>
     <w:rPr>
       <w:color w:val="19177c"/>
     </w:rPr>
   </w:style>
-  <w:style w:type="character" w:customStyle="1" w:styleId="ControlFlowTok">
+  <w:style w:customStyle="1" w:styleId="ControlFlowTok" w:type="character">
     <w:name w:val="ControlFlowTok"/>
     <w:basedOn w:val="VerbatimChar"/>
     <w:rPr>
@@ -7551,45 +8133,45 @@
       <w:b/>
     </w:rPr>
   </w:style>
-  <w:style w:type="character" w:customStyle="1" w:styleId="OperatorTok">
+  <w:style w:customStyle="1" w:styleId="OperatorTok" w:type="character">
     <w:name w:val="OperatorTok"/>
     <w:basedOn w:val="VerbatimChar"/>
     <w:rPr>
       <w:color w:val="666666"/>
     </w:rPr>
   </w:style>
-  <w:style w:type="character" w:customStyle="1" w:styleId="BuiltInTok">
+  <w:style w:customStyle="1" w:styleId="BuiltInTok" w:type="character">
     <w:name w:val="BuiltInTok"/>
     <w:basedOn w:val="VerbatimChar"/>
     <w:rPr>
       <w:color w:val="008000"/>
     </w:rPr>
   </w:style>
-  <w:style w:type="character" w:customStyle="1" w:styleId="ExtensionTok">
+  <w:style w:customStyle="1" w:styleId="ExtensionTok" w:type="character">
     <w:name w:val="ExtensionTok"/>
     <w:basedOn w:val="VerbatimChar"/>
     <w:rPr/>
   </w:style>
-  <w:style w:type="character" w:customStyle="1" w:styleId="PreprocessorTok">
+  <w:style w:customStyle="1" w:styleId="PreprocessorTok" w:type="character">
     <w:name w:val="PreprocessorTok"/>
     <w:basedOn w:val="VerbatimChar"/>
     <w:rPr>
       <w:color w:val="bc7a00"/>
     </w:rPr>
   </w:style>
-  <w:style w:type="character" w:customStyle="1" w:styleId="AttributeTok">
+  <w:style w:customStyle="1" w:styleId="AttributeTok" w:type="character">
     <w:name w:val="AttributeTok"/>
     <w:basedOn w:val="VerbatimChar"/>
     <w:rPr>
       <w:color w:val="7d9029"/>
     </w:rPr>
   </w:style>
-  <w:style w:type="character" w:customStyle="1" w:styleId="RegionMarkerTok">
+  <w:style w:customStyle="1" w:styleId="RegionMarkerTok" w:type="character">
     <w:name w:val="RegionMarkerTok"/>
     <w:basedOn w:val="VerbatimChar"/>
     <w:rPr/>
   </w:style>
-  <w:style w:type="character" w:customStyle="1" w:styleId="InformationTok">
+  <w:style w:customStyle="1" w:styleId="InformationTok" w:type="character">
     <w:name w:val="InformationTok"/>
     <w:basedOn w:val="VerbatimChar"/>
     <w:rPr>
@@ -7598,7 +8180,7 @@
       <w:i/>
     </w:rPr>
   </w:style>
-  <w:style w:type="character" w:customStyle="1" w:styleId="WarningTok">
+  <w:style w:customStyle="1" w:styleId="WarningTok" w:type="character">
     <w:name w:val="WarningTok"/>
     <w:basedOn w:val="VerbatimChar"/>
     <w:rPr>
@@ -7607,7 +8189,7 @@
       <w:i/>
     </w:rPr>
   </w:style>
-  <w:style w:type="character" w:customStyle="1" w:styleId="AlertTok">
+  <w:style w:customStyle="1" w:styleId="AlertTok" w:type="character">
     <w:name w:val="AlertTok"/>
     <w:basedOn w:val="VerbatimChar"/>
     <w:rPr>
@@ -7615,7 +8197,7 @@
       <w:b/>
     </w:rPr>
   </w:style>
-  <w:style w:type="character" w:customStyle="1" w:styleId="ErrorTok">
+  <w:style w:customStyle="1" w:styleId="ErrorTok" w:type="character">
     <w:name w:val="ErrorTok"/>
     <w:basedOn w:val="VerbatimChar"/>
     <w:rPr>
@@ -7623,7 +8205,7 @@
       <w:b/>
     </w:rPr>
   </w:style>
-  <w:style w:type="character" w:customStyle="1" w:styleId="NormalTok">
+  <w:style w:customStyle="1" w:styleId="NormalTok" w:type="character">
     <w:name w:val="NormalTok"/>
     <w:basedOn w:val="VerbatimChar"/>
     <w:rPr/>

</xml_diff>

<commit_message>
Balance termico: los rotulos de las paredes llevan solo la orientacion
Co-Authored-By: Claude Sonnet 5.5 <noreply@anthropic.com>
Claude-Session: https://claude.ai/code/session_01NNMcFTBbEuLfDho1wCZzu7
</commit_message>
<xml_diff>
--- a/planillas/Guia para la defensa del TP.docx
+++ b/planillas/Guia para la defensa del TP.docx
@@ -6170,13 +6170,13 @@
         <w:t xml:space="preserve"> </w:t>
       </w:r>
       <w:r>
-        <w:t xml:space="preserve">Aisladas: sólo la orientación, por</w:t>
-      </w:r>
-      <w:r>
-        <w:t xml:space="preserve"> </w:t>
-      </w:r>
-      <w:r>
-        <w:t xml:space="preserve">ejemplo</w:t>
+        <w:t xml:space="preserve">Sólo la orientación, tanto en las</w:t>
+      </w:r>
+      <w:r>
+        <w:t xml:space="preserve"> </w:t>
+      </w:r>
+      <w:r>
+        <w:t xml:space="preserve">aisladas como en las interiores:</w:t>
       </w:r>
       <w:r>
         <w:t xml:space="preserve"> </w:t>
@@ -6188,13 +6188,7 @@
         <w:t xml:space="preserve">AISLADAS (NO)</w:t>
       </w:r>
       <w:r>
-        <w:t xml:space="preserve">. Interiores: orientación y local con el que lindan, por</w:t>
-      </w:r>
-      <w:r>
-        <w:t xml:space="preserve"> </w:t>
-      </w:r>
-      <w:r>
-        <w:t xml:space="preserve">ejemplo</w:t>
+        <w:t xml:space="preserve">,</w:t>
       </w:r>
       <w:r>
         <w:t xml:space="preserve"> </w:t>
@@ -6203,10 +6197,16 @@
         <w:rPr>
           <w:rStyle w:val="VerbatimChar"/>
         </w:rPr>
-        <w:t xml:space="preserve">INTERIORES (NE, cocina)</w:t>
-      </w:r>
-      <w:r>
-        <w:t xml:space="preserve">. No se escribe la abertura.</w:t>
+        <w:t xml:space="preserve">INTERIORES (NE)</w:t>
+      </w:r>
+      <w:r>
+        <w:t xml:space="preserve">. No se</w:t>
+      </w:r>
+      <w:r>
+        <w:t xml:space="preserve"> </w:t>
+      </w:r>
+      <w:r>
+        <w:t xml:space="preserve">escribe con qué local linda ni qué abertura tiene.</w:t>
       </w:r>
     </w:p>
     <w:p>

</xml_diff>

<commit_message>
Guia de defensa: la puerta H01 (hierro) queda como punto a consultar
Co-Authored-By: Claude Sonnet 5.5 <noreply@anthropic.com>
Claude-Session: https://claude.ai/code/session_01NNMcFTBbEuLfDho1wCZzu7
</commit_message>
<xml_diff>
--- a/planillas/Guia para la defensa del TP.docx
+++ b/planillas/Guia para la defensa del TP.docx
@@ -6521,25 +6521,81 @@
           <w:bCs/>
           <w:b/>
         </w:rPr>
-        <w:t xml:space="preserve">Hall: la puerta de ingreso H01.</w:t>
-      </w:r>
-      <w:r>
-        <w:t xml:space="preserve"> </w:t>
-      </w:r>
-      <w:r>
-        <w:t xml:space="preserve">Mide 1,50 × 3,00 y está en la planilla de</w:t>
-      </w:r>
-      <w:r>
-        <w:t xml:space="preserve"> </w:t>
-      </w:r>
-      <w:r>
-        <w:t xml:space="preserve">herrería, no en la de carpintería. Se computó como abertura con factor 60. Si</w:t>
-      </w:r>
-      <w:r>
-        <w:t xml:space="preserve"> </w:t>
-      </w:r>
-      <w:r>
-        <w:t xml:space="preserve">fuera una puerta ciega de chapa convendría revisar el factor.</w:t>
+        <w:t xml:space="preserve">Hall: la puerta de ingreso H01 — a consultar.</w:t>
+      </w:r>
+      <w:r>
+        <w:t xml:space="preserve"> </w:t>
+      </w:r>
+      <w:r>
+        <w:t xml:space="preserve">Mide 1,50 × 3,00, es de</w:t>
+      </w:r>
+      <w:r>
+        <w:t xml:space="preserve"> </w:t>
+      </w:r>
+      <w:r>
+        <w:rPr>
+          <w:bCs/>
+          <w:b/>
+        </w:rPr>
+        <w:t xml:space="preserve">hierro</w:t>
+      </w:r>
+      <w:r>
+        <w:t xml:space="preserve"> </w:t>
+      </w:r>
+      <w:r>
+        <w:t xml:space="preserve">y está en la planilla de herrería, no en la de carpintería. Se la</w:t>
+      </w:r>
+      <w:r>
+        <w:t xml:space="preserve"> </w:t>
+      </w:r>
+      <w:r>
+        <w:t xml:space="preserve">computó como abertura (renglón VENTANA, factor 60), igual que si fuera</w:t>
+      </w:r>
+      <w:r>
+        <w:t xml:space="preserve"> </w:t>
+      </w:r>
+      <w:r>
+        <w:t xml:space="preserve">vidriada. Es la opción conservadora, pero la puerta es opaca, y como las</w:t>
+      </w:r>
+      <w:r>
+        <w:t xml:space="preserve"> </w:t>
+      </w:r>
+      <w:r>
+        <w:t xml:space="preserve">paredes se cuentan enteras, el área de la puerta ya está dentro de la pared SE</w:t>
+      </w:r>
+      <w:r>
+        <w:t xml:space="preserve"> </w:t>
+      </w:r>
+      <w:r>
+        <w:t xml:space="preserve">de 2,15 × 3,00 (factor 20).</w:t>
+      </w:r>
+      <w:r>
+        <w:t xml:space="preserve"> </w:t>
+      </w:r>
+      <w:r>
+        <w:rPr>
+          <w:bCs/>
+          <w:b/>
+        </w:rPr>
+        <w:t xml:space="preserve">Consultar</w:t>
+      </w:r>
+      <w:r>
+        <w:t xml:space="preserve"> </w:t>
+      </w:r>
+      <w:r>
+        <w:t xml:space="preserve">cómo trata las puertas el método de</w:t>
+      </w:r>
+      <w:r>
+        <w:t xml:space="preserve"> </w:t>
+      </w:r>
+      <w:r>
+        <w:t xml:space="preserve">la cátedra. Si no las carga como ventana, el hall pasa de 2.340 a 2.051 kcal/h</w:t>
+      </w:r>
+      <w:r>
+        <w:t xml:space="preserve"> </w:t>
+      </w:r>
+      <w:r>
+        <w:t xml:space="preserve">y el living de 8.065 a 7.776 kcal/h (de 30 a 29 elementos).</w:t>
       </w:r>
     </w:p>
     <w:p>
@@ -6730,35 +6786,23 @@
         <w:pStyle w:val="Compact"/>
       </w:pPr>
       <w:r>
-        <w:t xml:space="preserve">Quedan</w:t>
-      </w:r>
-      <w:r>
-        <w:t xml:space="preserve"> </w:t>
-      </w:r>
-      <w:r>
-        <w:rPr>
-          <w:bCs/>
-          <w:b/>
-        </w:rPr>
-        <w:t xml:space="preserve">orientaciones sin completar</w:t>
-      </w:r>
-      <w:r>
-        <w:t xml:space="preserve"> </w:t>
-      </w:r>
-      <w:r>
-        <w:t xml:space="preserve">en la escalera (las dos de 4,06), el</w:t>
-      </w:r>
-      <w:r>
-        <w:t xml:space="preserve"> </w:t>
-      </w:r>
-      <w:r>
-        <w:t xml:space="preserve">baño de visitas, y los dormitorios Norte y Sur y el baño 17 (la pared ciega y</w:t>
-      </w:r>
-      <w:r>
-        <w:t xml:space="preserve"> </w:t>
-      </w:r>
-      <w:r>
-        <w:t xml:space="preserve">la interior de cada uno).</w:t>
+        <w:rPr>
+          <w:bCs/>
+          <w:b/>
+        </w:rPr>
+        <w:t xml:space="preserve">Consultar:</w:t>
+      </w:r>
+      <w:r>
+        <w:t xml:space="preserve"> </w:t>
+      </w:r>
+      <w:r>
+        <w:t xml:space="preserve">si la puerta de hierro H01 se carga como abertura (factor 60) o</w:t>
+      </w:r>
+      <w:r>
+        <w:t xml:space="preserve"> </w:t>
+      </w:r>
+      <w:r>
+        <w:t xml:space="preserve">queda dentro de la pared. Hoy está cargada como vidriada.</w:t>
       </w:r>
     </w:p>
     <w:p>

</xml_diff>

<commit_message>
Guia de defensa: se saca un punto de la PF05 que ya quedo resuelto
Co-Authored-By: Claude Sonnet 5.5 <noreply@anthropic.com>
Claude-Session: https://claude.ai/code/session_01NNMcFTBbEuLfDho1wCZzu7
</commit_message>
<xml_diff>
--- a/planillas/Guia para la defensa del TP.docx
+++ b/planillas/Guia para la defensa del TP.docx
@@ -6741,40 +6741,6 @@
       </w:r>
       <w:r>
         <w:t xml:space="preserve">estructural) y la polilínea da unos 4,6 m².</w:t>
-      </w:r>
-    </w:p>
-    <w:p>
-      <w:pPr>
-        <w:numPr>
-          <w:ilvl w:val="0"/>
-          <w:numId w:val="1007"/>
-        </w:numPr>
-        <w:pStyle w:val="Compact"/>
-      </w:pPr>
-      <w:r>
-        <w:t xml:space="preserve">En la lámina de fachadas la</w:t>
-      </w:r>
-      <w:r>
-        <w:t xml:space="preserve"> </w:t>
-      </w:r>
-      <w:r>
-        <w:rPr>
-          <w:bCs/>
-          <w:b/>
-        </w:rPr>
-        <w:t xml:space="preserve">PF05 de la escalera</w:t>
-      </w:r>
-      <w:r>
-        <w:t xml:space="preserve"> </w:t>
-      </w:r>
-      <w:r>
-        <w:t xml:space="preserve">figura al NE, pero el lado</w:t>
-      </w:r>
-      <w:r>
-        <w:t xml:space="preserve"> </w:t>
-      </w:r>
-      <w:r>
-        <w:t xml:space="preserve">NE de la escalera quedó cargado como pared interior. Revisar.</w:t>
       </w:r>
     </w:p>
     <w:p>

</xml_diff>

<commit_message>
Medianeria: tipografia de las planillas, seccion en la guia de consulta y convenciones
Co-Authored-By: Claude Sonnet 5.5 <noreply@anthropic.com>
Claude-Session: https://claude.ai/code/session_01NNMcFTBbEuLfDho1wCZzu7
</commit_message>
<xml_diff>
--- a/planillas/Guia para la defensa del TP.docx
+++ b/planillas/Guia para la defensa del TP.docx
@@ -6771,6 +6771,1306 @@
         <w:t xml:space="preserve">queda dentro de la pared. Hoy está cargada como vidriada.</w:t>
       </w:r>
     </w:p>
+    <w:bookmarkEnd w:id="46"/>
+    <w:bookmarkEnd w:id="47"/>
+    <w:bookmarkStart w:id="54" w:name="liquidación-de-derechos-de-medianería"/>
+    <w:p>
+      <w:pPr>
+        <w:pStyle w:val="Heading1"/>
+      </w:pPr>
+      <w:r>
+        <w:t xml:space="preserve">4. Liquidación de derechos de medianería</w:t>
+      </w:r>
+    </w:p>
+    <w:p>
+      <w:pPr>
+        <w:pStyle w:val="FirstParagraph"/>
+      </w:pPr>
+      <w:r>
+        <w:rPr>
+          <w:iCs/>
+          <w:i/>
+        </w:rPr>
+        <w:t xml:space="preserve">Hoja de consulta. La planilla está en</w:t>
+      </w:r>
+      <w:r>
+        <w:rPr>
+          <w:iCs/>
+          <w:i/>
+        </w:rPr>
+        <w:t xml:space="preserve"> </w:t>
+      </w:r>
+      <w:r>
+        <w:rPr>
+          <w:rStyle w:val="VerbatimChar"/>
+          <w:iCs/>
+          <w:i/>
+        </w:rPr>
+        <w:t xml:space="preserve">planillas/medianeria/Planilla medianeria.xlsx</w:t>
+      </w:r>
+      <w:r>
+        <w:rPr>
+          <w:iCs/>
+          <w:i/>
+        </w:rPr>
+        <w:t xml:space="preserve">.</w:t>
+      </w:r>
+      <w:r>
+        <w:rPr>
+          <w:iCs/>
+          <w:i/>
+        </w:rPr>
+        <w:t xml:space="preserve"> </w:t>
+      </w:r>
+      <w:r>
+        <w:rPr>
+          <w:iCs/>
+          <w:i/>
+        </w:rPr>
+        <w:t xml:space="preserve">Se armó a partir de la planilla de ejemplo; los datos del caso propio se cargan a</w:t>
+      </w:r>
+      <w:r>
+        <w:rPr>
+          <w:iCs/>
+          <w:i/>
+        </w:rPr>
+        <w:t xml:space="preserve"> </w:t>
+      </w:r>
+      <w:r>
+        <w:rPr>
+          <w:iCs/>
+          <w:i/>
+        </w:rPr>
+        <w:t xml:space="preserve">continuación.</w:t>
+      </w:r>
+    </w:p>
+    <w:bookmarkStart w:id="48" w:name="para-qué-sirve"/>
+    <w:p>
+      <w:pPr>
+        <w:pStyle w:val="Heading2"/>
+      </w:pPr>
+      <w:r>
+        <w:t xml:space="preserve">4.1 Para qué sirve</w:t>
+      </w:r>
+    </w:p>
+    <w:p>
+      <w:pPr>
+        <w:pStyle w:val="FirstParagraph"/>
+      </w:pPr>
+      <w:r>
+        <w:t xml:space="preserve">Cuando un propietario (</w:t>
+      </w:r>
+      <w:r>
+        <w:t xml:space="preserve">“</w:t>
+      </w:r>
+      <w:r>
+        <w:t xml:space="preserve">A</w:t>
+      </w:r>
+      <w:r>
+        <w:t xml:space="preserve">”</w:t>
+      </w:r>
+      <w:r>
+        <w:t xml:space="preserve">) construye un muro contra el límite y el vecino (</w:t>
+      </w:r>
+      <w:r>
+        <w:t xml:space="preserve">“</w:t>
+      </w:r>
+      <w:r>
+        <w:t xml:space="preserve">1</w:t>
+      </w:r>
+      <w:r>
+        <w:t xml:space="preserve">”</w:t>
+      </w:r>
+      <w:r>
+        <w:t xml:space="preserve">)</w:t>
+      </w:r>
+      <w:r>
+        <w:t xml:space="preserve"> </w:t>
+      </w:r>
+      <w:r>
+        <w:t xml:space="preserve">lo aprovecha apoyando o adosando su edificio, el segundo le</w:t>
+      </w:r>
+      <w:r>
+        <w:t xml:space="preserve"> </w:t>
+      </w:r>
+      <w:r>
+        <w:rPr>
+          <w:bCs/>
+          <w:b/>
+        </w:rPr>
+        <w:t xml:space="preserve">reembolsa la mitad</w:t>
+      </w:r>
+      <w:r>
+        <w:rPr>
+          <w:bCs/>
+          <w:b/>
+        </w:rPr>
+        <w:t xml:space="preserve"> </w:t>
+      </w:r>
+      <w:r>
+        <w:rPr>
+          <w:bCs/>
+          <w:b/>
+        </w:rPr>
+        <w:t xml:space="preserve">del valor actual del muro</w:t>
+      </w:r>
+      <w:r>
+        <w:t xml:space="preserve">. La planilla calcula ese valor: cuánto costaría</w:t>
+      </w:r>
+      <w:r>
+        <w:t xml:space="preserve"> </w:t>
+      </w:r>
+      <w:r>
+        <w:t xml:space="preserve">rehacer el muro (valor de reposición), cuánto de ese valor se perdió por el paso</w:t>
+      </w:r>
+      <w:r>
+        <w:t xml:space="preserve"> </w:t>
+      </w:r>
+      <w:r>
+        <w:t xml:space="preserve">del tiempo (depreciación) y cuánto le toca pagar a cada parte.</w:t>
+      </w:r>
+    </w:p>
+    <w:bookmarkEnd w:id="48"/>
+    <w:bookmarkStart w:id="49" w:name="cómo-se-calcula-columna-por-columna"/>
+    <w:p>
+      <w:pPr>
+        <w:pStyle w:val="Heading2"/>
+      </w:pPr>
+      <w:r>
+        <w:t xml:space="preserve">4.2 Cómo se calcula, columna por columna</w:t>
+      </w:r>
+    </w:p>
+    <w:tbl>
+      <w:tblPr>
+        <w:tblStyle w:val="Table"/>
+        <w:tblW w:type="pct" w:w="5000"/>
+        <w:tblLook w:firstRow="1" w:lastRow="0" w:firstColumn="0" w:lastColumn="0" w:noHBand="0" w:noVBand="0" w:val="0020"/>
+        <w:jc w:val="start"/>
+      </w:tblPr>
+      <w:tblGrid>
+        <w:gridCol w:w="2640"/>
+        <w:gridCol w:w="2640"/>
+        <w:gridCol w:w="2640"/>
+      </w:tblGrid>
+      <w:tr>
+        <w:trPr>
+          <w:tblHeader w:val="true"/>
+        </w:trPr>
+        <w:tc>
+          <w:tcPr/>
+          <w:p>
+            <w:pPr>
+              <w:pStyle w:val="Compact"/>
+              <w:jc w:val="left"/>
+            </w:pPr>
+            <w:r>
+              <w:t xml:space="preserve">Columna</w:t>
+            </w:r>
+          </w:p>
+        </w:tc>
+        <w:tc>
+          <w:tcPr/>
+          <w:p>
+            <w:pPr>
+              <w:pStyle w:val="Compact"/>
+              <w:jc w:val="left"/>
+            </w:pPr>
+            <w:r>
+              <w:t xml:space="preserve">Qué es</w:t>
+            </w:r>
+          </w:p>
+        </w:tc>
+        <w:tc>
+          <w:tcPr/>
+          <w:p>
+            <w:pPr>
+              <w:pStyle w:val="Compact"/>
+              <w:jc w:val="left"/>
+            </w:pPr>
+            <w:r>
+              <w:t xml:space="preserve">Cómo se obtiene</w:t>
+            </w:r>
+          </w:p>
+        </w:tc>
+      </w:tr>
+      <w:tr>
+        <w:tc>
+          <w:tcPr/>
+          <w:p>
+            <w:pPr>
+              <w:pStyle w:val="Compact"/>
+              <w:jc w:val="left"/>
+            </w:pPr>
+            <w:r>
+              <w:t xml:space="preserve">Largo, alto, ancho</w:t>
+            </w:r>
+          </w:p>
+        </w:tc>
+        <w:tc>
+          <w:tcPr/>
+          <w:p>
+            <w:pPr>
+              <w:pStyle w:val="Compact"/>
+              <w:jc w:val="left"/>
+            </w:pPr>
+            <w:r>
+              <w:t xml:space="preserve">medidas de cada ítem del muro</w:t>
+            </w:r>
+          </w:p>
+        </w:tc>
+        <w:tc>
+          <w:tcPr/>
+          <w:p>
+            <w:pPr>
+              <w:pStyle w:val="Compact"/>
+              <w:jc w:val="left"/>
+            </w:pPr>
+            <w:r>
+              <w:t xml:space="preserve">se miden</w:t>
+            </w:r>
+          </w:p>
+        </w:tc>
+      </w:tr>
+      <w:tr>
+        <w:tc>
+          <w:tcPr/>
+          <w:p>
+            <w:pPr>
+              <w:pStyle w:val="Compact"/>
+              <w:jc w:val="left"/>
+            </w:pPr>
+            <w:r>
+              <w:t xml:space="preserve">Cómputo métrico</w:t>
+            </w:r>
+          </w:p>
+        </w:tc>
+        <w:tc>
+          <w:tcPr/>
+          <w:p>
+            <w:pPr>
+              <w:pStyle w:val="Compact"/>
+              <w:jc w:val="left"/>
+            </w:pPr>
+            <w:r>
+              <w:t xml:space="preserve">cantidad de obra</w:t>
+            </w:r>
+          </w:p>
+        </w:tc>
+        <w:tc>
+          <w:tcPr/>
+          <w:p>
+            <w:pPr>
+              <w:pStyle w:val="Compact"/>
+              <w:jc w:val="left"/>
+            </w:pPr>
+            <w:r>
+              <w:t xml:space="preserve">largo × alto × ancho (m³); en los revoques, la superficie (m²)</w:t>
+            </w:r>
+          </w:p>
+        </w:tc>
+      </w:tr>
+      <w:tr>
+        <w:tc>
+          <w:tcPr/>
+          <w:p>
+            <w:pPr>
+              <w:pStyle w:val="Compact"/>
+              <w:jc w:val="left"/>
+            </w:pPr>
+            <w:r>
+              <w:t xml:space="preserve">Coste unitario</w:t>
+            </w:r>
+          </w:p>
+        </w:tc>
+        <w:tc>
+          <w:tcPr/>
+          <w:p>
+            <w:pPr>
+              <w:pStyle w:val="Compact"/>
+              <w:jc w:val="left"/>
+            </w:pPr>
+            <w:r>
+              <w:t xml:space="preserve">precio del ítem sin IVA</w:t>
+            </w:r>
+          </w:p>
+        </w:tc>
+        <w:tc>
+          <w:tcPr/>
+          <w:p>
+            <w:pPr>
+              <w:pStyle w:val="Compact"/>
+              <w:jc w:val="left"/>
+            </w:pPr>
+            <w:r>
+              <w:t xml:space="preserve">de la lista de precios del mes</w:t>
+            </w:r>
+          </w:p>
+        </w:tc>
+      </w:tr>
+      <w:tr>
+        <w:tc>
+          <w:tcPr/>
+          <w:p>
+            <w:pPr>
+              <w:pStyle w:val="Compact"/>
+              <w:jc w:val="left"/>
+            </w:pPr>
+            <w:r>
+              <w:t xml:space="preserve">IVA</w:t>
+            </w:r>
+          </w:p>
+        </w:tc>
+        <w:tc>
+          <w:tcPr/>
+          <w:p>
+            <w:pPr>
+              <w:pStyle w:val="Compact"/>
+              <w:jc w:val="left"/>
+            </w:pPr>
+            <w:r>
+              <w:t xml:space="preserve">21 % del coste</w:t>
+            </w:r>
+          </w:p>
+        </w:tc>
+        <w:tc>
+          <w:tcPr/>
+          <w:p>
+            <w:pPr>
+              <w:pStyle w:val="Compact"/>
+              <w:jc w:val="left"/>
+            </w:pPr>
+            <w:r>
+              <w:t xml:space="preserve">coste × 0,21</w:t>
+            </w:r>
+          </w:p>
+        </w:tc>
+      </w:tr>
+      <w:tr>
+        <w:tc>
+          <w:tcPr/>
+          <w:p>
+            <w:pPr>
+              <w:pStyle w:val="Compact"/>
+              <w:jc w:val="left"/>
+            </w:pPr>
+            <w:r>
+              <w:t xml:space="preserve">Precio unitario</w:t>
+            </w:r>
+          </w:p>
+        </w:tc>
+        <w:tc>
+          <w:tcPr/>
+          <w:p>
+            <w:pPr>
+              <w:pStyle w:val="Compact"/>
+              <w:jc w:val="left"/>
+            </w:pPr>
+            <w:r>
+              <w:t xml:space="preserve">coste con IVA</w:t>
+            </w:r>
+          </w:p>
+        </w:tc>
+        <w:tc>
+          <w:tcPr/>
+          <w:p>
+            <w:pPr>
+              <w:pStyle w:val="Compact"/>
+              <w:jc w:val="left"/>
+            </w:pPr>
+            <w:r>
+              <w:t xml:space="preserve">coste + IVA</w:t>
+            </w:r>
+          </w:p>
+        </w:tc>
+      </w:tr>
+      <w:tr>
+        <w:tc>
+          <w:tcPr/>
+          <w:p>
+            <w:pPr>
+              <w:pStyle w:val="Compact"/>
+              <w:jc w:val="left"/>
+            </w:pPr>
+            <w:r>
+              <w:t xml:space="preserve">Valor de reposición</w:t>
+            </w:r>
+          </w:p>
+        </w:tc>
+        <w:tc>
+          <w:tcPr/>
+          <w:p>
+            <w:pPr>
+              <w:pStyle w:val="Compact"/>
+              <w:jc w:val="left"/>
+            </w:pPr>
+            <w:r>
+              <w:t xml:space="preserve">cuánto cuesta hacerlo nuevo</w:t>
+            </w:r>
+          </w:p>
+        </w:tc>
+        <w:tc>
+          <w:tcPr/>
+          <w:p>
+            <w:pPr>
+              <w:pStyle w:val="Compact"/>
+              <w:jc w:val="left"/>
+            </w:pPr>
+            <w:r>
+              <w:t xml:space="preserve">cómputo × precio unitario</w:t>
+            </w:r>
+          </w:p>
+        </w:tc>
+      </w:tr>
+      <w:tr>
+        <w:tc>
+          <w:tcPr/>
+          <w:p>
+            <w:pPr>
+              <w:pStyle w:val="Compact"/>
+              <w:jc w:val="left"/>
+            </w:pPr>
+            <w:r>
+              <w:t xml:space="preserve">Antigüedad</w:t>
+            </w:r>
+          </w:p>
+        </w:tc>
+        <w:tc>
+          <w:tcPr/>
+          <w:p>
+            <w:pPr>
+              <w:pStyle w:val="Compact"/>
+              <w:jc w:val="left"/>
+            </w:pPr>
+            <w:r>
+              <w:t xml:space="preserve">años del muro</w:t>
+            </w:r>
+          </w:p>
+        </w:tc>
+        <w:tc>
+          <w:tcPr/>
+          <w:p>
+            <w:pPr>
+              <w:pStyle w:val="Compact"/>
+              <w:jc w:val="left"/>
+            </w:pPr>
+            <w:r>
+              <w:t xml:space="preserve">dato del caso</w:t>
+            </w:r>
+          </w:p>
+        </w:tc>
+      </w:tr>
+      <w:tr>
+        <w:tc>
+          <w:tcPr/>
+          <w:p>
+            <w:pPr>
+              <w:pStyle w:val="Compact"/>
+              <w:jc w:val="left"/>
+            </w:pPr>
+            <w:r>
+              <w:t xml:space="preserve">Estado del muro</w:t>
+            </w:r>
+          </w:p>
+        </w:tc>
+        <w:tc>
+          <w:tcPr/>
+          <w:p>
+            <w:pPr>
+              <w:pStyle w:val="Compact"/>
+              <w:jc w:val="left"/>
+            </w:pPr>
+            <w:r>
+              <w:t xml:space="preserve">conservación (1 a 5, según la tabla)</w:t>
+            </w:r>
+          </w:p>
+        </w:tc>
+        <w:tc>
+          <w:tcPr/>
+          <w:p>
+            <w:pPr>
+              <w:pStyle w:val="Compact"/>
+              <w:jc w:val="left"/>
+            </w:pPr>
+            <w:r>
+              <w:t xml:space="preserve">dato del caso</w:t>
+            </w:r>
+          </w:p>
+        </w:tc>
+      </w:tr>
+      <w:tr>
+        <w:tc>
+          <w:tcPr/>
+          <w:p>
+            <w:pPr>
+              <w:pStyle w:val="Compact"/>
+              <w:jc w:val="left"/>
+            </w:pPr>
+            <w:r>
+              <w:t xml:space="preserve">Vida útil</w:t>
+            </w:r>
+          </w:p>
+        </w:tc>
+        <w:tc>
+          <w:tcPr/>
+          <w:p>
+            <w:pPr>
+              <w:pStyle w:val="Compact"/>
+              <w:jc w:val="left"/>
+            </w:pPr>
+            <w:r>
+              <w:t xml:space="preserve">años que dura ese ítem</w:t>
+            </w:r>
+          </w:p>
+        </w:tc>
+        <w:tc>
+          <w:tcPr/>
+          <w:p>
+            <w:pPr>
+              <w:pStyle w:val="Compact"/>
+              <w:jc w:val="left"/>
+            </w:pPr>
+            <w:r>
+              <w:t xml:space="preserve">tabla por tipo de ítem</w:t>
+            </w:r>
+          </w:p>
+        </w:tc>
+      </w:tr>
+      <w:tr>
+        <w:tc>
+          <w:tcPr/>
+          <w:p>
+            <w:pPr>
+              <w:pStyle w:val="Compact"/>
+              <w:jc w:val="left"/>
+            </w:pPr>
+            <w:r>
+              <w:t xml:space="preserve">% edad / vida útil</w:t>
+            </w:r>
+          </w:p>
+        </w:tc>
+        <w:tc>
+          <w:tcPr/>
+          <w:p>
+            <w:pPr>
+              <w:pStyle w:val="Compact"/>
+              <w:jc w:val="left"/>
+            </w:pPr>
+            <w:r>
+              <w:t xml:space="preserve">cuánto de su vida ya gastó</w:t>
+            </w:r>
+          </w:p>
+        </w:tc>
+        <w:tc>
+          <w:tcPr/>
+          <w:p>
+            <w:pPr>
+              <w:pStyle w:val="Compact"/>
+              <w:jc w:val="left"/>
+            </w:pPr>
+            <w:r>
+              <w:t xml:space="preserve">antigüedad ÷ vida útil</w:t>
+            </w:r>
+          </w:p>
+        </w:tc>
+      </w:tr>
+      <w:tr>
+        <w:tc>
+          <w:tcPr/>
+          <w:p>
+            <w:pPr>
+              <w:pStyle w:val="Compact"/>
+              <w:jc w:val="left"/>
+            </w:pPr>
+            <w:r>
+              <w:t xml:space="preserve">Valor residual</w:t>
+            </w:r>
+          </w:p>
+        </w:tc>
+        <w:tc>
+          <w:tcPr/>
+          <w:p>
+            <w:pPr>
+              <w:pStyle w:val="Compact"/>
+              <w:jc w:val="left"/>
+            </w:pPr>
+            <w:r>
+              <w:t xml:space="preserve">lo que vale al final de la vida útil</w:t>
+            </w:r>
+          </w:p>
+        </w:tc>
+        <w:tc>
+          <w:tcPr/>
+          <w:p>
+            <w:pPr>
+              <w:pStyle w:val="Compact"/>
+              <w:jc w:val="left"/>
+            </w:pPr>
+            <w:r>
+              <w:t xml:space="preserve">un porcentaje del valor de reposición (5 % en la mampostería de elevación)</w:t>
+            </w:r>
+          </w:p>
+        </w:tc>
+      </w:tr>
+      <w:tr>
+        <w:tc>
+          <w:tcPr/>
+          <w:p>
+            <w:pPr>
+              <w:pStyle w:val="Compact"/>
+              <w:jc w:val="left"/>
+            </w:pPr>
+            <w:r>
+              <w:t xml:space="preserve">Depreciación (Ross-Heidecke)</w:t>
+            </w:r>
+          </w:p>
+        </w:tc>
+        <w:tc>
+          <w:tcPr/>
+          <w:p>
+            <w:pPr>
+              <w:pStyle w:val="Compact"/>
+              <w:jc w:val="left"/>
+            </w:pPr>
+            <w:r>
+              <w:t xml:space="preserve">coeficiente de la tabla</w:t>
+            </w:r>
+          </w:p>
+        </w:tc>
+        <w:tc>
+          <w:tcPr/>
+          <w:p>
+            <w:pPr>
+              <w:pStyle w:val="Compact"/>
+              <w:jc w:val="left"/>
+            </w:pPr>
+            <w:r>
+              <w:t xml:space="preserve">se busca por % de edad y estado</w:t>
+            </w:r>
+          </w:p>
+        </w:tc>
+      </w:tr>
+      <w:tr>
+        <w:tc>
+          <w:tcPr/>
+          <w:p>
+            <w:pPr>
+              <w:pStyle w:val="Compact"/>
+              <w:jc w:val="left"/>
+            </w:pPr>
+            <w:r>
+              <w:t xml:space="preserve">Valor actual</w:t>
+            </w:r>
+          </w:p>
+        </w:tc>
+        <w:tc>
+          <w:tcPr/>
+          <w:p>
+            <w:pPr>
+              <w:pStyle w:val="Compact"/>
+              <w:jc w:val="left"/>
+            </w:pPr>
+            <w:r>
+              <w:t xml:space="preserve">valor de reposición ya depreciado</w:t>
+            </w:r>
+          </w:p>
+        </w:tc>
+        <w:tc>
+          <w:tcPr/>
+          <w:p>
+            <w:pPr>
+              <w:pStyle w:val="Compact"/>
+              <w:jc w:val="left"/>
+            </w:pPr>
+            <w:r>
+              <w:t xml:space="preserve">ver 4.4</w:t>
+            </w:r>
+          </w:p>
+        </w:tc>
+      </w:tr>
+      <w:tr>
+        <w:tc>
+          <w:tcPr/>
+          <w:p>
+            <w:pPr>
+              <w:pStyle w:val="Compact"/>
+              <w:jc w:val="left"/>
+            </w:pPr>
+            <w:r>
+              <w:t xml:space="preserve">Total a liquidar</w:t>
+            </w:r>
+          </w:p>
+        </w:tc>
+        <w:tc>
+          <w:tcPr/>
+          <w:p>
+            <w:pPr>
+              <w:pStyle w:val="Compact"/>
+              <w:jc w:val="left"/>
+            </w:pPr>
+            <w:r>
+              <w:t xml:space="preserve">lo que paga el vecino</w:t>
+            </w:r>
+          </w:p>
+        </w:tc>
+        <w:tc>
+          <w:tcPr/>
+          <w:p>
+            <w:pPr>
+              <w:pStyle w:val="Compact"/>
+              <w:jc w:val="left"/>
+            </w:pPr>
+            <w:r>
+              <w:t xml:space="preserve">la mitad del valor actual</w:t>
+            </w:r>
+          </w:p>
+        </w:tc>
+      </w:tr>
+    </w:tbl>
+    <w:p>
+      <w:pPr>
+        <w:pStyle w:val="BodyText"/>
+      </w:pPr>
+      <w:r>
+        <w:t xml:space="preserve">Debajo del total van el</w:t>
+      </w:r>
+      <w:r>
+        <w:t xml:space="preserve"> </w:t>
+      </w:r>
+      <w:r>
+        <w:rPr>
+          <w:bCs/>
+          <w:b/>
+        </w:rPr>
+        <w:t xml:space="preserve">valor de reposición total</w:t>
+      </w:r>
+      <w:r>
+        <w:t xml:space="preserve"> </w:t>
+      </w:r>
+      <w:r>
+        <w:t xml:space="preserve">y los</w:t>
+      </w:r>
+      <w:r>
+        <w:t xml:space="preserve"> </w:t>
+      </w:r>
+      <w:r>
+        <w:rPr>
+          <w:bCs/>
+          <w:b/>
+        </w:rPr>
+        <w:t xml:space="preserve">honorarios del</w:t>
+      </w:r>
+      <w:r>
+        <w:rPr>
+          <w:bCs/>
+          <w:b/>
+        </w:rPr>
+        <w:t xml:space="preserve"> </w:t>
+      </w:r>
+      <w:r>
+        <w:rPr>
+          <w:bCs/>
+          <w:b/>
+        </w:rPr>
+        <w:t xml:space="preserve">liquidador (10 % del valor de reposición)</w:t>
+      </w:r>
+      <w:r>
+        <w:t xml:space="preserve">, que se cobran aparte.</w:t>
+      </w:r>
+    </w:p>
+    <w:bookmarkEnd w:id="49"/>
+    <w:bookmarkStart w:id="50" w:name="los-ítems-del-muro-de-ejemplo"/>
+    <w:p>
+      <w:pPr>
+        <w:pStyle w:val="Heading2"/>
+      </w:pPr>
+      <w:r>
+        <w:t xml:space="preserve">4.3 Los ítems del muro de ejemplo</w:t>
+      </w:r>
+    </w:p>
+    <w:p>
+      <w:pPr>
+        <w:pStyle w:val="FirstParagraph"/>
+      </w:pPr>
+      <w:r>
+        <w:t xml:space="preserve">Excavación de cimientos, banquina de hormigón sin armar, mampostería de</w:t>
+      </w:r>
+      <w:r>
+        <w:t xml:space="preserve"> </w:t>
+      </w:r>
+      <w:r>
+        <w:t xml:space="preserve">cimientos de 45 cm, encadenado de cimientos, mampostería de cimientos de 30 cm,</w:t>
+      </w:r>
+      <w:r>
+        <w:t xml:space="preserve"> </w:t>
+      </w:r>
+      <w:r>
+        <w:t xml:space="preserve">doble capa aisladora (horizontal y vertical), mampostería de elevación, revoque</w:t>
+      </w:r>
+      <w:r>
+        <w:t xml:space="preserve"> </w:t>
+      </w:r>
+      <w:r>
+        <w:t xml:space="preserve">exterior y revoque interior. La excavación no se deprecia (queda enterrada y no</w:t>
+      </w:r>
+      <w:r>
+        <w:t xml:space="preserve"> </w:t>
+      </w:r>
+      <w:r>
+        <w:t xml:space="preserve">envejece): su valor actual es igual al de reposición.</w:t>
+      </w:r>
+    </w:p>
+    <w:p>
+      <w:pPr>
+        <w:pStyle w:val="BodyText"/>
+      </w:pPr>
+      <w:r>
+        <w:t xml:space="preserve">Dos cómputos especiales: la</w:t>
+      </w:r>
+      <w:r>
+        <w:t xml:space="preserve"> </w:t>
+      </w:r>
+      <w:r>
+        <w:rPr>
+          <w:bCs/>
+          <w:b/>
+        </w:rPr>
+        <w:t xml:space="preserve">doble capa aisladora</w:t>
+      </w:r>
+      <w:r>
+        <w:t xml:space="preserve"> </w:t>
+      </w:r>
+      <w:r>
+        <w:t xml:space="preserve">se mide como</w:t>
+      </w:r>
+      <w:r>
+        <w:t xml:space="preserve"> </w:t>
+      </w:r>
+      <w:r>
+        <w:t xml:space="preserve">largo × 2 × (alto + ancho), y los</w:t>
+      </w:r>
+      <w:r>
+        <w:t xml:space="preserve"> </w:t>
+      </w:r>
+      <w:r>
+        <w:rPr>
+          <w:bCs/>
+          <w:b/>
+        </w:rPr>
+        <w:t xml:space="preserve">revoques</w:t>
+      </w:r>
+      <w:r>
+        <w:t xml:space="preserve"> </w:t>
+      </w:r>
+      <w:r>
+        <w:t xml:space="preserve">se miden por superficie, no por</w:t>
+      </w:r>
+      <w:r>
+        <w:t xml:space="preserve"> </w:t>
+      </w:r>
+      <w:r>
+        <w:t xml:space="preserve">volumen.</w:t>
+      </w:r>
+    </w:p>
+    <w:bookmarkEnd w:id="50"/>
+    <w:bookmarkStart w:id="51" w:name="Xf793da653d0a9df18adae6eb69d5180aa6b2119"/>
+    <w:p>
+      <w:pPr>
+        <w:pStyle w:val="Heading2"/>
+      </w:pPr>
+      <w:r>
+        <w:t xml:space="preserve">4.4 Un punto a consultar: la fórmula del valor actual</w:t>
+      </w:r>
+    </w:p>
+    <w:p>
+      <w:pPr>
+        <w:pStyle w:val="FirstParagraph"/>
+      </w:pPr>
+      <w:r>
+        <w:t xml:space="preserve">En la planilla de ejemplo el valor actual da</w:t>
+      </w:r>
+      <w:r>
+        <w:t xml:space="preserve"> </w:t>
+      </w:r>
+      <w:r>
+        <w:rPr>
+          <w:bCs/>
+          <w:b/>
+        </w:rPr>
+        <w:t xml:space="preserve">más de 12 veces el valor de</w:t>
+      </w:r>
+      <w:r>
+        <w:rPr>
+          <w:bCs/>
+          <w:b/>
+        </w:rPr>
+        <w:t xml:space="preserve"> </w:t>
+      </w:r>
+      <w:r>
+        <w:rPr>
+          <w:bCs/>
+          <w:b/>
+        </w:rPr>
+        <w:t xml:space="preserve">reposición</w:t>
+      </w:r>
+      <w:r>
+        <w:t xml:space="preserve"> </w:t>
+      </w:r>
+      <w:r>
+        <w:t xml:space="preserve">(por ejemplo la banquina: $ 82.664 de reposición y $ 1.036.610 de</w:t>
+      </w:r>
+      <w:r>
+        <w:t xml:space="preserve"> </w:t>
+      </w:r>
+      <w:r>
+        <w:t xml:space="preserve">valor actual), y el total a liquidar ($ 11,8 millones) es 8,5 veces el valor de</w:t>
+      </w:r>
+      <w:r>
+        <w:t xml:space="preserve"> </w:t>
+      </w:r>
+      <w:r>
+        <w:t xml:space="preserve">reposición total ($ 1,39 millones). Es imposible: un muro usado no puede valer</w:t>
+      </w:r>
+      <w:r>
+        <w:t xml:space="preserve"> </w:t>
+      </w:r>
+      <w:r>
+        <w:t xml:space="preserve">más que uno nuevo. El ejemplo parece multiplicar por (coeficiente − 1) cuando</w:t>
+      </w:r>
+      <w:r>
+        <w:t xml:space="preserve"> </w:t>
+      </w:r>
+      <w:r>
+        <w:t xml:space="preserve">debería multiplicar por (1 − coeficiente / 100).</w:t>
+      </w:r>
+    </w:p>
+    <w:p>
+      <w:pPr>
+        <w:pStyle w:val="BodyText"/>
+      </w:pPr>
+      <w:r>
+        <w:t xml:space="preserve">La forma habitual es:</w:t>
+      </w:r>
+    </w:p>
+    <w:p>
+      <w:pPr>
+        <w:pStyle w:val="SourceCode"/>
+      </w:pPr>
+      <w:r>
+        <w:rPr>
+          <w:rStyle w:val="VerbatimChar"/>
+        </w:rPr>
+        <w:t xml:space="preserve">Valor actual = (Valor de reposición − Valor residual) × (1 − Coef. Ross-Heidecke / 100) + Valor residual</w:t>
+      </w:r>
+    </w:p>
+    <w:p>
+      <w:pPr>
+        <w:pStyle w:val="FirstParagraph"/>
+      </w:pPr>
+      <w:r>
+        <w:t xml:space="preserve">La planilla quedó, por ahora,</w:t>
+      </w:r>
+      <w:r>
+        <w:t xml:space="preserve"> </w:t>
+      </w:r>
+      <w:r>
+        <w:rPr>
+          <w:bCs/>
+          <w:b/>
+        </w:rPr>
+        <w:t xml:space="preserve">igual que el ejemplo</w:t>
+      </w:r>
+      <w:r>
+        <w:t xml:space="preserve"> </w:t>
+      </w:r>
+      <w:r>
+        <w:t xml:space="preserve">para poder compararla.</w:t>
+      </w:r>
+      <w:r>
+        <w:t xml:space="preserve"> </w:t>
+      </w:r>
+      <w:r>
+        <w:rPr>
+          <w:bCs/>
+          <w:b/>
+        </w:rPr>
+        <w:t xml:space="preserve">Consultar con la cátedra</w:t>
+      </w:r>
+      <w:r>
+        <w:t xml:space="preserve"> </w:t>
+      </w:r>
+      <w:r>
+        <w:t xml:space="preserve">cuál es la fórmula correcta antes de cargar los datos</w:t>
+      </w:r>
+      <w:r>
+        <w:t xml:space="preserve"> </w:t>
+      </w:r>
+      <w:r>
+        <w:t xml:space="preserve">propios y corregirla en la columna</w:t>
+      </w:r>
+      <w:r>
+        <w:t xml:space="preserve"> </w:t>
+      </w:r>
+      <w:r>
+        <w:t xml:space="preserve">“</w:t>
+      </w:r>
+      <w:r>
+        <w:t xml:space="preserve">Valor actual</w:t>
+      </w:r>
+      <w:r>
+        <w:t xml:space="preserve">”</w:t>
+      </w:r>
+      <w:r>
+        <w:t xml:space="preserve">.</w:t>
+      </w:r>
+    </w:p>
+    <w:bookmarkEnd w:id="51"/>
+    <w:bookmarkStart w:id="52" w:name="X8e280e577bf27d431e16f3827fb041cd14b9646"/>
+    <w:p>
+      <w:pPr>
+        <w:pStyle w:val="Heading2"/>
+      </w:pPr>
+      <w:r>
+        <w:t xml:space="preserve">4.5 Datos que hay que reunir para el caso propio</w:t>
+      </w:r>
+    </w:p>
+    <w:p>
+      <w:pPr>
+        <w:numPr>
+          <w:ilvl w:val="0"/>
+          <w:numId w:val="1008"/>
+        </w:numPr>
+        <w:pStyle w:val="Compact"/>
+      </w:pPr>
+      <w:r>
+        <w:t xml:space="preserve">Largo, alto y espesor del muro medianero, y de cada ítem (cimientos,</w:t>
+      </w:r>
+      <w:r>
+        <w:t xml:space="preserve"> </w:t>
+      </w:r>
+      <w:r>
+        <w:t xml:space="preserve">encadenado, capa aisladora, elevación).</w:t>
+      </w:r>
+    </w:p>
+    <w:p>
+      <w:pPr>
+        <w:numPr>
+          <w:ilvl w:val="0"/>
+          <w:numId w:val="1008"/>
+        </w:numPr>
+        <w:pStyle w:val="Compact"/>
+      </w:pPr>
+      <w:r>
+        <w:t xml:space="preserve">Materiales de cada ítem y su espesor.</w:t>
+      </w:r>
+    </w:p>
+    <w:p>
+      <w:pPr>
+        <w:numPr>
+          <w:ilvl w:val="0"/>
+          <w:numId w:val="1008"/>
+        </w:numPr>
+        <w:pStyle w:val="Compact"/>
+      </w:pPr>
+      <w:r>
+        <w:t xml:space="preserve">Precios actualizados al mes que se liquida (coste sin IVA).</w:t>
+      </w:r>
+    </w:p>
+    <w:p>
+      <w:pPr>
+        <w:numPr>
+          <w:ilvl w:val="0"/>
+          <w:numId w:val="1008"/>
+        </w:numPr>
+        <w:pStyle w:val="Compact"/>
+      </w:pPr>
+      <w:r>
+        <w:t xml:space="preserve">Antigüedad del muro y estado de conservación.</w:t>
+      </w:r>
+    </w:p>
+    <w:p>
+      <w:pPr>
+        <w:numPr>
+          <w:ilvl w:val="0"/>
+          <w:numId w:val="1008"/>
+        </w:numPr>
+        <w:pStyle w:val="Compact"/>
+      </w:pPr>
+      <w:r>
+        <w:t xml:space="preserve">Vida útil de cada ítem y coeficiente de Ross-Heidecke (de la tabla de la</w:t>
+      </w:r>
+      <w:r>
+        <w:t xml:space="preserve"> </w:t>
+      </w:r>
+      <w:r>
+        <w:t xml:space="preserve">cátedra).</w:t>
+      </w:r>
+    </w:p>
+    <w:p>
+      <w:pPr>
+        <w:numPr>
+          <w:ilvl w:val="0"/>
+          <w:numId w:val="1008"/>
+        </w:numPr>
+        <w:pStyle w:val="Compact"/>
+      </w:pPr>
+      <w:r>
+        <w:t xml:space="preserve">Quiénes son las partes (</w:t>
+      </w:r>
+      <w:r>
+        <w:t xml:space="preserve">“</w:t>
+      </w:r>
+      <w:r>
+        <w:t xml:space="preserve">A</w:t>
+      </w:r>
+      <w:r>
+        <w:t xml:space="preserve">”</w:t>
+      </w:r>
+      <w:r>
+        <w:t xml:space="preserve"> </w:t>
+      </w:r>
+      <w:r>
+        <w:t xml:space="preserve">y</w:t>
+      </w:r>
+      <w:r>
+        <w:t xml:space="preserve"> </w:t>
+      </w:r>
+      <w:r>
+        <w:t xml:space="preserve">“</w:t>
+      </w:r>
+      <w:r>
+        <w:t xml:space="preserve">1</w:t>
+      </w:r>
+      <w:r>
+        <w:t xml:space="preserve">”</w:t>
+      </w:r>
+      <w:r>
+        <w:t xml:space="preserve">), la fecha y la ciudad, para el texto del pie.</w:t>
+      </w:r>
+    </w:p>
+    <w:bookmarkEnd w:id="52"/>
+    <w:bookmarkStart w:id="53" w:name="formato-de-las-planillas"/>
+    <w:p>
+      <w:pPr>
+        <w:pStyle w:val="Heading2"/>
+      </w:pPr>
+      <w:r>
+        <w:t xml:space="preserve">4.6 Formato de las planillas</w:t>
+      </w:r>
+    </w:p>
+    <w:p>
+      <w:pPr>
+        <w:pStyle w:val="FirstParagraph"/>
+      </w:pPr>
+      <w:r>
+        <w:t xml:space="preserve">Lo que se viene aplicando en todas las planillas, para no olvidarlo:</w:t>
+      </w:r>
+    </w:p>
+    <w:p>
+      <w:pPr>
+        <w:numPr>
+          <w:ilvl w:val="0"/>
+          <w:numId w:val="1009"/>
+        </w:numPr>
+        <w:pStyle w:val="Compact"/>
+      </w:pPr>
+      <w:r>
+        <w:rPr>
+          <w:bCs/>
+          <w:b/>
+        </w:rPr>
+        <w:t xml:space="preserve">Tipografía:</w:t>
+      </w:r>
+      <w:r>
+        <w:t xml:space="preserve"> </w:t>
+      </w:r>
+      <w:r>
+        <w:t xml:space="preserve">Bahnschrift Light Condensed, tamaño 12.</w:t>
+      </w:r>
+    </w:p>
+    <w:p>
+      <w:pPr>
+        <w:numPr>
+          <w:ilvl w:val="0"/>
+          <w:numId w:val="1009"/>
+        </w:numPr>
+        <w:pStyle w:val="Compact"/>
+      </w:pPr>
+      <w:r>
+        <w:rPr>
+          <w:bCs/>
+          <w:b/>
+        </w:rPr>
+        <w:t xml:space="preserve">Títulos</w:t>
+      </w:r>
+      <w:r>
+        <w:t xml:space="preserve"> </w:t>
+      </w:r>
+      <w:r>
+        <w:t xml:space="preserve">(filas con relleno gris): 1 cm de alto. Resto de las filas: 0,7 cm.</w:t>
+      </w:r>
+    </w:p>
+    <w:p>
+      <w:pPr>
+        <w:numPr>
+          <w:ilvl w:val="0"/>
+          <w:numId w:val="1009"/>
+        </w:numPr>
+        <w:pStyle w:val="Compact"/>
+      </w:pPr>
+      <w:r>
+        <w:rPr>
+          <w:bCs/>
+          <w:b/>
+        </w:rPr>
+        <w:t xml:space="preserve">Líneas:</w:t>
+      </w:r>
+      <w:r>
+        <w:t xml:space="preserve"> </w:t>
+      </w:r>
+      <w:r>
+        <w:t xml:space="preserve">perímetro y títulos en línea llena; el resto de las líneas</w:t>
+      </w:r>
+      <w:r>
+        <w:t xml:space="preserve"> </w:t>
+      </w:r>
+      <w:r>
+        <w:t xml:space="preserve">interiores, en línea de puntos.</w:t>
+      </w:r>
+    </w:p>
+    <w:p>
+      <w:pPr>
+        <w:numPr>
+          <w:ilvl w:val="0"/>
+          <w:numId w:val="1009"/>
+        </w:numPr>
+        <w:pStyle w:val="Compact"/>
+      </w:pPr>
+      <w:r>
+        <w:rPr>
+          <w:bCs/>
+          <w:b/>
+        </w:rPr>
+        <w:t xml:space="preserve">Espacio</w:t>
+      </w:r>
+      <w:r>
+        <w:t xml:space="preserve"> </w:t>
+      </w:r>
+      <w:r>
+        <w:t xml:space="preserve">en blanco entre una planilla y la siguiente.</w:t>
+      </w:r>
+    </w:p>
+    <w:p>
+      <w:pPr>
+        <w:numPr>
+          <w:ilvl w:val="0"/>
+          <w:numId w:val="1009"/>
+        </w:numPr>
+        <w:pStyle w:val="Compact"/>
+      </w:pPr>
+      <w:r>
+        <w:t xml:space="preserve">Versión para AutoCAD: sin fórmulas (valores fijos).</w:t>
+      </w:r>
+    </w:p>
     <w:p>
       <w:r>
         <w:pict>
@@ -6778,9 +8078,9 @@
         </w:pict>
       </w:r>
     </w:p>
-    <w:bookmarkEnd w:id="46"/>
-    <w:bookmarkEnd w:id="47"/>
-    <w:bookmarkStart w:id="48" w:name="resumen-de-verificaciones"/>
+    <w:bookmarkEnd w:id="53"/>
+    <w:bookmarkEnd w:id="54"/>
+    <w:bookmarkStart w:id="55" w:name="resumen-de-verificaciones"/>
     <w:p>
       <w:pPr>
         <w:pStyle w:val="Heading1"/>
@@ -7105,7 +8405,7 @@
         <w:t xml:space="preserve">.</w:t>
       </w:r>
     </w:p>
-    <w:bookmarkEnd w:id="48"/>
+    <w:bookmarkEnd w:id="55"/>
     <w:sectPr/>
   </w:body>
 </w:document>
@@ -7476,6 +8776,12 @@
     </w:lvlOverride>
   </w:num>
   <w:num w:numId="1007">
+    <w:abstractNumId w:val="991"/>
+  </w:num>
+  <w:num w:numId="1008">
+    <w:abstractNumId w:val="991"/>
+  </w:num>
+  <w:num w:numId="1009">
     <w:abstractNumId w:val="991"/>
   </w:num>
 </w:numbering>

</xml_diff>